<commit_message>
update report and code for part 5
</commit_message>
<xml_diff>
--- a/PRACTICE_6/G03_Report_06.docx
+++ b/PRACTICE_6/G03_Report_06.docx
@@ -1,6 +1,6 @@
 
 <file path=word/document.xml><?xml version="1.0" encoding="utf-8"?>
-<w:document xmlns:wpc="http://schemas.microsoft.com/office/word/2010/wordprocessingCanvas" xmlns:cx="http://schemas.microsoft.com/office/drawing/2014/chartex" xmlns:cx1="http://schemas.microsoft.com/office/drawing/2015/9/8/chartex" xmlns:cx2="http://schemas.microsoft.com/office/drawing/2015/10/21/chartex" xmlns:cx3="http://schemas.microsoft.com/office/drawing/2016/5/9/chartex" xmlns:cx4="http://schemas.microsoft.com/office/drawing/2016/5/10/chartex" xmlns:cx5="http://schemas.microsoft.com/office/drawing/2016/5/11/chartex" xmlns:cx6="http://schemas.microsoft.com/office/drawing/2016/5/12/chartex" xmlns:cx7="http://schemas.microsoft.com/office/drawing/2016/5/13/chartex" xmlns:cx8="http://schemas.microsoft.com/office/drawing/2016/5/14/chartex" xmlns:mc="http://schemas.openxmlformats.org/markup-compatibility/2006" xmlns:aink="http://schemas.microsoft.com/office/drawing/2016/ink" xmlns:am3d="http://schemas.microsoft.com/office/drawing/2017/model3d" xmlns:o="urn:schemas-microsoft-com:office:office" xmlns:oel="http://schemas.microsoft.com/office/2019/extlst" xmlns:r="http://schemas.openxmlformats.org/officeDocument/2006/relationships" xmlns:m="http://schemas.openxmlformats.org/officeDocument/2006/math" xmlns:v="urn:schemas-microsoft-com:vml" xmlns:wp14="http://schemas.microsoft.com/office/word/2010/wordprocessingDrawing" xmlns:wp="http://schemas.openxmlformats.org/drawingml/2006/wordprocessingDrawing" xmlns:w10="urn:schemas-microsoft-com:office:word" xmlns:w="http://schemas.openxmlformats.org/wordprocessingml/2006/main" xmlns:w14="http://schemas.microsoft.com/office/word/2010/wordml" xmlns:w15="http://schemas.microsoft.com/office/word/2012/wordml" xmlns:w16cex="http://schemas.microsoft.com/office/word/2018/wordml/cex" xmlns:w16cid="http://schemas.microsoft.com/office/word/2016/wordml/cid" xmlns:w16="http://schemas.microsoft.com/office/word/2018/wordml" xmlns:w16du="http://schemas.microsoft.com/office/word/2023/wordml/word16du" xmlns:w16sdtdh="http://schemas.microsoft.com/office/word/2020/wordml/sdtdatahash" xmlns:w16sdtfl="http://schemas.microsoft.com/office/word/2024/wordml/sdtformatlock" xmlns:w16se="http://schemas.microsoft.com/office/word/2015/wordml/symex" xmlns:wpg="http://schemas.microsoft.com/office/word/2010/wordprocessingGroup" xmlns:wpi="http://schemas.microsoft.com/office/word/2010/wordprocessingInk" xmlns:wne="http://schemas.microsoft.com/office/word/2006/wordml" xmlns:wps="http://schemas.microsoft.com/office/word/2010/wordprocessingShape" mc:Ignorable="w14 w15 w16se w16cid w16 w16cex w16sdtdh w16sdtfl w16du wp14">
+<w:document xmlns:wpc="http://schemas.microsoft.com/office/word/2010/wordprocessingCanvas" xmlns:cx="http://schemas.microsoft.com/office/drawing/2014/chartex" xmlns:cx1="http://schemas.microsoft.com/office/drawing/2015/9/8/chartex" xmlns:cx2="http://schemas.microsoft.com/office/drawing/2015/10/21/chartex" xmlns:cx3="http://schemas.microsoft.com/office/drawing/2016/5/9/chartex" xmlns:cx4="http://schemas.microsoft.com/office/drawing/2016/5/10/chartex" xmlns:cx5="http://schemas.microsoft.com/office/drawing/2016/5/11/chartex" xmlns:cx6="http://schemas.microsoft.com/office/drawing/2016/5/12/chartex" xmlns:cx7="http://schemas.microsoft.com/office/drawing/2016/5/13/chartex" xmlns:cx8="http://schemas.microsoft.com/office/drawing/2016/5/14/chartex" xmlns:mc="http://schemas.openxmlformats.org/markup-compatibility/2006" xmlns:aink="http://schemas.microsoft.com/office/drawing/2016/ink" xmlns:am3d="http://schemas.microsoft.com/office/drawing/2017/model3d" xmlns:o="urn:schemas-microsoft-com:office:office" xmlns:oel="http://schemas.microsoft.com/office/2019/extlst" xmlns:r="http://schemas.openxmlformats.org/officeDocument/2006/relationships" xmlns:m="http://schemas.openxmlformats.org/officeDocument/2006/math" xmlns:v="urn:schemas-microsoft-com:vml" xmlns:wp14="http://schemas.microsoft.com/office/word/2010/wordprocessingDrawing" xmlns:wp="http://schemas.openxmlformats.org/drawingml/2006/wordprocessingDrawing" xmlns:w10="urn:schemas-microsoft-com:office:word" xmlns:w="http://schemas.openxmlformats.org/wordprocessingml/2006/main" xmlns:w14="http://schemas.microsoft.com/office/word/2010/wordml" xmlns:w15="http://schemas.microsoft.com/office/word/2012/wordml" xmlns:w16cex="http://schemas.microsoft.com/office/word/2018/wordml/cex" xmlns:w16cid="http://schemas.microsoft.com/office/word/2016/wordml/cid" xmlns:w16="http://schemas.microsoft.com/office/word/2018/wordml" xmlns:w16du="http://schemas.microsoft.com/office/word/2023/wordml/word16du" xmlns:w16sdtdh="http://schemas.microsoft.com/office/word/2020/wordml/sdtdatahash" xmlns:w16sdtfl="http://schemas.microsoft.com/office/word/2024/wordml/sdtformatlock" xmlns:w16se="http://schemas.microsoft.com/office/word/2015/wordml/symex" xmlns:wpg="http://schemas.microsoft.com/office/word/2010/wordprocessingGroup" xmlns:wpi="http://schemas.microsoft.com/office/word/2010/wordprocessingInk" xmlns:wne="http://schemas.microsoft.com/office/word/2006/wordml" xmlns:wps="http://schemas.microsoft.com/office/word/2010/wordprocessingShape" xmlns:a="http://schemas.openxmlformats.org/drawingml/2006/main" xmlns:pic="http://schemas.openxmlformats.org/drawingml/2006/picture" xmlns:a14="http://schemas.microsoft.com/office/drawing/2010/main" mc:Ignorable="w14 w15 w16se w16cid w16 w16cex w16sdtdh w16sdtfl w16du wp14">
   <w:body>
     <w:p>
       <w:pPr>
@@ -547,45 +547,37 @@
       <w:pPr>
         <w:rPr>
           <w:rFonts w:ascii="Times New Roman" w:hAnsi="Times New Roman" w:cs="Times New Roman"/>
-          <w:highlight w:val="yellow"/>
-        </w:rPr>
-      </w:pPr>
-      <w:r>
-        <w:rPr>
-          <w:rFonts w:ascii="Times New Roman" w:hAnsi="Times New Roman" w:cs="Times New Roman"/>
-          <w:highlight w:val="yellow"/>
+        </w:rPr>
+      </w:pPr>
+      <w:r>
+        <w:rPr>
+          <w:rFonts w:ascii="Times New Roman" w:hAnsi="Times New Roman" w:cs="Times New Roman"/>
         </w:rPr>
         <w:t>4</w:t>
       </w:r>
       <w:r>
         <w:rPr>
           <w:rFonts w:ascii="Times New Roman" w:hAnsi="Times New Roman" w:cs="Times New Roman"/>
-          <w:highlight w:val="yellow"/>
         </w:rPr>
         <w:t xml:space="preserve">. </w:t>
       </w:r>
       <w:r>
         <w:rPr>
           <w:rFonts w:ascii="Times New Roman" w:hAnsi="Times New Roman" w:cs="Times New Roman"/>
-          <w:highlight w:val="yellow"/>
         </w:rPr>
         <w:t xml:space="preserve">Código completo de </w:t>
       </w:r>
-      <w:proofErr w:type="spellStart"/>
-      <w:r>
-        <w:rPr>
-          <w:rFonts w:ascii="Times New Roman" w:hAnsi="Times New Roman" w:cs="Times New Roman"/>
-          <w:i/>
-          <w:iCs/>
-          <w:highlight w:val="yellow"/>
+      <w:r>
+        <w:rPr>
+          <w:rFonts w:ascii="Times New Roman" w:hAnsi="Times New Roman" w:cs="Times New Roman"/>
+          <w:i w:val="1"/>
+          <w:iCs w:val="1"/>
         </w:rPr>
         <w:t>train-test</w:t>
       </w:r>
-      <w:proofErr w:type="spellEnd"/>
-      <w:r>
-        <w:rPr>
-          <w:rFonts w:ascii="Times New Roman" w:hAnsi="Times New Roman" w:cs="Times New Roman"/>
-          <w:highlight w:val="yellow"/>
+      <w:r>
+        <w:rPr>
+          <w:rFonts w:ascii="Times New Roman" w:hAnsi="Times New Roman" w:cs="Times New Roman"/>
         </w:rPr>
         <w:t xml:space="preserve"> e análise de resultados</w:t>
       </w:r>
@@ -594,124 +586,103 @@
       <w:pPr>
         <w:rPr>
           <w:rFonts w:ascii="Times New Roman" w:hAnsi="Times New Roman" w:cs="Times New Roman"/>
-          <w:highlight w:val="yellow"/>
-        </w:rPr>
-      </w:pPr>
-      <w:r>
-        <w:rPr>
-          <w:rFonts w:ascii="Times New Roman" w:hAnsi="Times New Roman" w:cs="Times New Roman"/>
-          <w:highlight w:val="yellow"/>
+        </w:rPr>
+      </w:pPr>
+      <w:r>
+        <w:rPr>
+          <w:rFonts w:ascii="Times New Roman" w:hAnsi="Times New Roman" w:cs="Times New Roman"/>
         </w:rPr>
         <w:t>5</w:t>
       </w:r>
       <w:r>
         <w:rPr>
           <w:rFonts w:ascii="Times New Roman" w:hAnsi="Times New Roman" w:cs="Times New Roman"/>
-          <w:highlight w:val="yellow"/>
         </w:rPr>
         <w:t xml:space="preserve">. </w:t>
       </w:r>
       <w:r>
         <w:rPr>
           <w:rFonts w:ascii="Times New Roman" w:hAnsi="Times New Roman" w:cs="Times New Roman"/>
-          <w:highlight w:val="yellow"/>
         </w:rPr>
         <w:t xml:space="preserve">Análise e implementação </w:t>
       </w:r>
-      <w:proofErr w:type="spellStart"/>
-      <w:r>
-        <w:rPr>
-          <w:rFonts w:ascii="Times New Roman" w:hAnsi="Times New Roman" w:cs="Times New Roman"/>
-          <w:i/>
-          <w:iCs/>
-          <w:highlight w:val="yellow"/>
+      <w:r>
+        <w:rPr>
+          <w:rFonts w:ascii="Times New Roman" w:hAnsi="Times New Roman" w:cs="Times New Roman"/>
+          <w:i w:val="1"/>
+          <w:iCs w:val="1"/>
         </w:rPr>
         <w:t>bootstrap</w:t>
       </w:r>
-      <w:proofErr w:type="spellEnd"/>
-    </w:p>
-    <w:p>
-      <w:pPr>
-        <w:rPr>
-          <w:rFonts w:ascii="Times New Roman" w:hAnsi="Times New Roman" w:cs="Times New Roman"/>
-          <w:highlight w:val="yellow"/>
-        </w:rPr>
-      </w:pPr>
-      <w:r>
-        <w:rPr>
-          <w:rFonts w:ascii="Times New Roman" w:hAnsi="Times New Roman" w:cs="Times New Roman"/>
-          <w:highlight w:val="yellow"/>
+    </w:p>
+    <w:p>
+      <w:pPr>
+        <w:rPr>
+          <w:rFonts w:ascii="Times New Roman" w:hAnsi="Times New Roman" w:cs="Times New Roman"/>
+        </w:rPr>
+      </w:pPr>
+      <w:r>
+        <w:rPr>
+          <w:rFonts w:ascii="Times New Roman" w:hAnsi="Times New Roman" w:cs="Times New Roman"/>
         </w:rPr>
         <w:t>6</w:t>
       </w:r>
       <w:r>
         <w:rPr>
           <w:rFonts w:ascii="Times New Roman" w:hAnsi="Times New Roman" w:cs="Times New Roman"/>
-          <w:highlight w:val="yellow"/>
         </w:rPr>
         <w:t xml:space="preserve">. </w:t>
       </w:r>
       <w:r>
         <w:rPr>
           <w:rFonts w:ascii="Times New Roman" w:hAnsi="Times New Roman" w:cs="Times New Roman"/>
-          <w:highlight w:val="yellow"/>
         </w:rPr>
         <w:t xml:space="preserve">Construção de classificador e método de separação </w:t>
       </w:r>
-      <w:proofErr w:type="spellStart"/>
-      <w:r>
-        <w:rPr>
-          <w:rFonts w:ascii="Times New Roman" w:hAnsi="Times New Roman" w:cs="Times New Roman"/>
-          <w:i/>
-          <w:iCs/>
-          <w:highlight w:val="yellow"/>
+      <w:r>
+        <w:rPr>
+          <w:rFonts w:ascii="Times New Roman" w:hAnsi="Times New Roman" w:cs="Times New Roman"/>
+          <w:i w:val="1"/>
+          <w:iCs w:val="1"/>
         </w:rPr>
         <w:t>train-test</w:t>
       </w:r>
-      <w:proofErr w:type="spellEnd"/>
-    </w:p>
-    <w:p>
-      <w:pPr>
-        <w:rPr>
-          <w:rFonts w:ascii="Times New Roman" w:hAnsi="Times New Roman" w:cs="Times New Roman"/>
-        </w:rPr>
-      </w:pPr>
-      <w:r>
-        <w:rPr>
-          <w:rFonts w:ascii="Times New Roman" w:hAnsi="Times New Roman" w:cs="Times New Roman"/>
-          <w:highlight w:val="yellow"/>
+    </w:p>
+    <w:p>
+      <w:pPr>
+        <w:rPr>
+          <w:rFonts w:ascii="Times New Roman" w:hAnsi="Times New Roman" w:cs="Times New Roman"/>
+        </w:rPr>
+      </w:pPr>
+      <w:r>
+        <w:rPr>
+          <w:rFonts w:ascii="Times New Roman" w:hAnsi="Times New Roman" w:cs="Times New Roman"/>
         </w:rPr>
         <w:t>7</w:t>
       </w:r>
       <w:r>
         <w:rPr>
           <w:rFonts w:ascii="Times New Roman" w:hAnsi="Times New Roman" w:cs="Times New Roman"/>
-          <w:highlight w:val="yellow"/>
         </w:rPr>
         <w:t>.</w:t>
       </w:r>
       <w:r>
         <w:rPr>
           <w:rFonts w:ascii="Times New Roman" w:hAnsi="Times New Roman" w:cs="Times New Roman"/>
-          <w:highlight w:val="yellow"/>
         </w:rPr>
         <w:t xml:space="preserve"> Classificar, </w:t>
       </w:r>
-      <w:proofErr w:type="spellStart"/>
-      <w:r>
-        <w:rPr>
-          <w:rFonts w:ascii="Times New Roman" w:hAnsi="Times New Roman" w:cs="Times New Roman"/>
-          <w:i/>
-          <w:iCs/>
-          <w:highlight w:val="yellow"/>
+      <w:r>
+        <w:rPr>
+          <w:rFonts w:ascii="Times New Roman" w:hAnsi="Times New Roman" w:cs="Times New Roman"/>
+          <w:i w:val="1"/>
+          <w:iCs w:val="1"/>
         </w:rPr>
         <w:t>train-test</w:t>
       </w:r>
-      <w:proofErr w:type="spellEnd"/>
-      <w:r>
-        <w:rPr>
-          <w:rFonts w:ascii="Times New Roman" w:hAnsi="Times New Roman" w:cs="Times New Roman"/>
-          <w:highlight w:val="yellow"/>
+      <w:r>
+        <w:rPr>
+          <w:rFonts w:ascii="Times New Roman" w:hAnsi="Times New Roman" w:cs="Times New Roman"/>
         </w:rPr>
         <w:t xml:space="preserve"> e pontuação geral</w:t>
       </w:r>
@@ -3062,120 +3033,107 @@
       <w:pPr>
         <w:rPr>
           <w:rFonts w:ascii="Times New Roman" w:hAnsi="Times New Roman" w:cs="Times New Roman"/>
-          <w:b/>
-          <w:bCs/>
+          <w:b w:val="1"/>
+          <w:bCs w:val="1"/>
           <w:sz w:val="28"/>
           <w:szCs w:val="28"/>
-          <w:highlight w:val="yellow"/>
-        </w:rPr>
-      </w:pPr>
-      <w:r>
-        <w:rPr>
-          <w:rFonts w:ascii="Times New Roman" w:hAnsi="Times New Roman" w:cs="Times New Roman"/>
-          <w:b/>
-          <w:bCs/>
+        </w:rPr>
+      </w:pPr>
+      <w:r>
+        <w:rPr>
+          <w:rFonts w:ascii="Times New Roman" w:hAnsi="Times New Roman" w:cs="Times New Roman"/>
+          <w:b w:val="1"/>
+          <w:bCs w:val="1"/>
           <w:sz w:val="28"/>
           <w:szCs w:val="28"/>
-          <w:highlight w:val="yellow"/>
         </w:rPr>
         <w:t>4</w:t>
       </w:r>
       <w:r>
         <w:rPr>
           <w:rFonts w:ascii="Times New Roman" w:hAnsi="Times New Roman" w:cs="Times New Roman"/>
-          <w:b/>
-          <w:bCs/>
+          <w:b w:val="1"/>
+          <w:bCs w:val="1"/>
           <w:sz w:val="28"/>
           <w:szCs w:val="28"/>
-          <w:highlight w:val="yellow"/>
         </w:rPr>
         <w:t xml:space="preserve">. Código completo de </w:t>
       </w:r>
-      <w:proofErr w:type="spellStart"/>
-      <w:r>
-        <w:rPr>
-          <w:rFonts w:ascii="Times New Roman" w:hAnsi="Times New Roman" w:cs="Times New Roman"/>
-          <w:b/>
-          <w:bCs/>
-          <w:i/>
-          <w:iCs/>
+      <w:r>
+        <w:rPr>
+          <w:rFonts w:ascii="Times New Roman" w:hAnsi="Times New Roman" w:cs="Times New Roman"/>
+          <w:b w:val="1"/>
+          <w:bCs w:val="1"/>
+          <w:i w:val="1"/>
+          <w:iCs w:val="1"/>
           <w:sz w:val="28"/>
           <w:szCs w:val="28"/>
-          <w:highlight w:val="yellow"/>
         </w:rPr>
         <w:t>train-test</w:t>
       </w:r>
-      <w:proofErr w:type="spellEnd"/>
-      <w:r>
-        <w:rPr>
-          <w:rFonts w:ascii="Times New Roman" w:hAnsi="Times New Roman" w:cs="Times New Roman"/>
-          <w:b/>
-          <w:bCs/>
-          <w:i/>
-          <w:iCs/>
+      <w:r>
+        <w:rPr>
+          <w:rFonts w:ascii="Times New Roman" w:hAnsi="Times New Roman" w:cs="Times New Roman"/>
+          <w:b w:val="1"/>
+          <w:bCs w:val="1"/>
+          <w:i w:val="1"/>
+          <w:iCs w:val="1"/>
           <w:sz w:val="28"/>
           <w:szCs w:val="28"/>
-          <w:highlight w:val="yellow"/>
         </w:rPr>
         <w:t xml:space="preserve"> </w:t>
       </w:r>
       <w:r>
         <w:rPr>
           <w:rFonts w:ascii="Times New Roman" w:hAnsi="Times New Roman" w:cs="Times New Roman"/>
-          <w:b/>
-          <w:bCs/>
+          <w:b w:val="1"/>
+          <w:bCs w:val="1"/>
           <w:sz w:val="28"/>
           <w:szCs w:val="28"/>
-          <w:highlight w:val="yellow"/>
         </w:rPr>
         <w:t>e análise de resultados</w:t>
       </w:r>
     </w:p>
-    <w:p>
-      <w:pPr>
-        <w:rPr>
-          <w:rFonts w:ascii="Times New Roman" w:hAnsi="Times New Roman" w:cs="Times New Roman"/>
-          <w:highlight w:val="yellow"/>
-        </w:rPr>
-      </w:pPr>
-      <w:r>
-        <w:rPr>
-          <w:rFonts w:ascii="Times New Roman" w:hAnsi="Times New Roman" w:cs="Times New Roman"/>
-          <w:highlight w:val="yellow"/>
+    <w:p w14:noSpellErr="1">
+      <w:pPr>
+        <w:rPr>
+          <w:rFonts w:ascii="Times New Roman" w:hAnsi="Times New Roman" w:cs="Times New Roman"/>
+        </w:rPr>
+      </w:pPr>
+      <w:r>
+        <w:rPr>
+          <w:rFonts w:ascii="Times New Roman" w:hAnsi="Times New Roman" w:cs="Times New Roman"/>
         </w:rPr>
         <w:t>Aprofundamos as técnicas de validação, implementando vários métodos e analisando o seu comportamento.</w:t>
       </w:r>
     </w:p>
-    <w:p>
-      <w:pPr>
-        <w:rPr>
-          <w:rFonts w:ascii="Times New Roman" w:hAnsi="Times New Roman" w:cs="Times New Roman"/>
-          <w:b/>
-          <w:bCs/>
-          <w:sz w:val="24"/>
-          <w:szCs w:val="24"/>
-          <w:highlight w:val="yellow"/>
-        </w:rPr>
-      </w:pPr>
-      <w:r>
-        <w:rPr>
-          <w:rFonts w:ascii="Times New Roman" w:hAnsi="Times New Roman" w:cs="Times New Roman"/>
-          <w:b/>
-          <w:bCs/>
-          <w:sz w:val="24"/>
-          <w:szCs w:val="24"/>
-          <w:highlight w:val="yellow"/>
+    <w:p w14:noSpellErr="1">
+      <w:pPr>
+        <w:rPr>
+          <w:rFonts w:ascii="Times New Roman" w:hAnsi="Times New Roman" w:cs="Times New Roman"/>
+          <w:b w:val="1"/>
+          <w:bCs w:val="1"/>
+          <w:sz w:val="24"/>
+          <w:szCs w:val="24"/>
+        </w:rPr>
+      </w:pPr>
+      <w:r>
+        <w:rPr>
+          <w:rFonts w:ascii="Times New Roman" w:hAnsi="Times New Roman" w:cs="Times New Roman"/>
+          <w:b w:val="1"/>
+          <w:bCs w:val="1"/>
+          <w:sz w:val="24"/>
+          <w:szCs w:val="24"/>
         </w:rPr>
         <w:t>4</w:t>
       </w:r>
       <w:r>
         <w:rPr>
           <w:rFonts w:ascii="Times New Roman" w:hAnsi="Times New Roman" w:cs="Times New Roman"/>
-          <w:b/>
-          <w:bCs/>
-          <w:sz w:val="24"/>
-          <w:szCs w:val="24"/>
-          <w:highlight w:val="yellow"/>
+          <w:b w:val="1"/>
+          <w:bCs w:val="1"/>
+          <w:sz w:val="24"/>
+          <w:szCs w:val="24"/>
         </w:rPr>
         <w:t>. a)</w:t>
       </w:r>
@@ -3184,415 +3142,732 @@
       <w:pPr>
         <w:rPr>
           <w:rFonts w:ascii="Times New Roman" w:hAnsi="Times New Roman" w:cs="Times New Roman"/>
-          <w:highlight w:val="yellow"/>
-        </w:rPr>
-      </w:pPr>
-      <w:r>
-        <w:rPr>
-          <w:rFonts w:ascii="Times New Roman" w:hAnsi="Times New Roman" w:cs="Times New Roman"/>
-          <w:highlight w:val="yellow"/>
-        </w:rPr>
-        <w:t>INTRODUÇÃO</w:t>
-      </w:r>
-    </w:p>
-    <w:p>
-      <w:pPr>
-        <w:rPr>
-          <w:rFonts w:ascii="Times New Roman" w:hAnsi="Times New Roman" w:cs="Times New Roman"/>
-          <w:sz w:val="18"/>
-          <w:szCs w:val="18"/>
-          <w:highlight w:val="yellow"/>
-        </w:rPr>
-      </w:pPr>
-      <w:r>
-        <w:rPr>
-          <w:rFonts w:ascii="Times New Roman" w:hAnsi="Times New Roman" w:cs="Times New Roman"/>
-          <w:sz w:val="18"/>
-          <w:szCs w:val="18"/>
-          <w:highlight w:val="yellow"/>
-        </w:rPr>
-        <w:t>X</w:t>
-      </w:r>
-    </w:p>
-    <w:p>
-      <w:pPr>
-        <w:rPr>
-          <w:rFonts w:ascii="Times New Roman" w:hAnsi="Times New Roman" w:cs="Times New Roman"/>
-          <w:sz w:val="18"/>
-          <w:szCs w:val="18"/>
-          <w:highlight w:val="yellow"/>
-        </w:rPr>
-      </w:pPr>
-      <w:r>
-        <w:rPr>
-          <w:rFonts w:ascii="Times New Roman" w:hAnsi="Times New Roman" w:cs="Times New Roman"/>
-          <w:sz w:val="18"/>
-          <w:szCs w:val="18"/>
-          <w:highlight w:val="yellow"/>
-        </w:rPr>
-        <w:t xml:space="preserve">Figura </w:t>
-      </w:r>
-      <w:r>
-        <w:rPr>
-          <w:rFonts w:ascii="Times New Roman" w:hAnsi="Times New Roman" w:cs="Times New Roman"/>
-          <w:sz w:val="18"/>
-          <w:szCs w:val="18"/>
-          <w:highlight w:val="yellow"/>
-        </w:rPr>
-        <w:t>9</w:t>
-      </w:r>
-      <w:r>
-        <w:rPr>
-          <w:rFonts w:ascii="Times New Roman" w:hAnsi="Times New Roman" w:cs="Times New Roman"/>
-          <w:sz w:val="18"/>
-          <w:szCs w:val="18"/>
-          <w:highlight w:val="yellow"/>
-        </w:rPr>
-        <w:t>. Legenda.</w:t>
-      </w:r>
-    </w:p>
-    <w:p>
-      <w:pPr>
-        <w:rPr>
-          <w:rFonts w:ascii="Times New Roman" w:hAnsi="Times New Roman" w:cs="Times New Roman"/>
-          <w:b/>
-          <w:bCs/>
-          <w:sz w:val="24"/>
-          <w:szCs w:val="24"/>
-          <w:highlight w:val="yellow"/>
-        </w:rPr>
-      </w:pPr>
-      <w:r>
-        <w:rPr>
-          <w:rFonts w:ascii="Times New Roman" w:hAnsi="Times New Roman" w:cs="Times New Roman"/>
-          <w:b/>
-          <w:bCs/>
-          <w:sz w:val="24"/>
-          <w:szCs w:val="24"/>
-          <w:highlight w:val="yellow"/>
-        </w:rPr>
-        <w:t>4</w:t>
-      </w:r>
-      <w:r>
-        <w:rPr>
-          <w:rFonts w:ascii="Times New Roman" w:hAnsi="Times New Roman" w:cs="Times New Roman"/>
-          <w:b/>
-          <w:bCs/>
-          <w:sz w:val="24"/>
-          <w:szCs w:val="24"/>
-          <w:highlight w:val="yellow"/>
-        </w:rPr>
-        <w:t>. b)</w:t>
-      </w:r>
-    </w:p>
-    <w:p>
-      <w:pPr>
-        <w:rPr>
-          <w:rFonts w:ascii="Times New Roman" w:hAnsi="Times New Roman" w:cs="Times New Roman"/>
-          <w:highlight w:val="yellow"/>
-        </w:rPr>
-      </w:pPr>
-      <w:r>
-        <w:rPr>
-          <w:rFonts w:ascii="Times New Roman" w:hAnsi="Times New Roman" w:cs="Times New Roman"/>
-          <w:highlight w:val="yellow"/>
-        </w:rPr>
-        <w:t>INTRODUÇÃO</w:t>
-      </w:r>
-    </w:p>
-    <w:p>
-      <w:pPr>
-        <w:rPr>
-          <w:rFonts w:ascii="Times New Roman" w:hAnsi="Times New Roman" w:cs="Times New Roman"/>
-          <w:highlight w:val="yellow"/>
-        </w:rPr>
-      </w:pPr>
-      <w:r>
-        <w:rPr>
-          <w:rFonts w:ascii="Times New Roman" w:hAnsi="Times New Roman" w:cs="Times New Roman"/>
-          <w:highlight w:val="yellow"/>
-        </w:rPr>
-        <w:t>X</w:t>
-      </w:r>
-    </w:p>
-    <w:p>
-      <w:pPr>
-        <w:rPr>
-          <w:rFonts w:ascii="Times New Roman" w:hAnsi="Times New Roman" w:cs="Times New Roman"/>
-          <w:sz w:val="18"/>
-          <w:szCs w:val="18"/>
-          <w:highlight w:val="yellow"/>
-        </w:rPr>
-      </w:pPr>
-      <w:r>
-        <w:rPr>
-          <w:rFonts w:ascii="Times New Roman" w:hAnsi="Times New Roman" w:cs="Times New Roman"/>
-          <w:sz w:val="18"/>
-          <w:szCs w:val="18"/>
-          <w:highlight w:val="yellow"/>
-        </w:rPr>
-        <w:t xml:space="preserve">Figura </w:t>
-      </w:r>
-      <w:r>
-        <w:rPr>
-          <w:rFonts w:ascii="Times New Roman" w:hAnsi="Times New Roman" w:cs="Times New Roman"/>
-          <w:sz w:val="18"/>
-          <w:szCs w:val="18"/>
-          <w:highlight w:val="yellow"/>
-        </w:rPr>
-        <w:t>1</w:t>
-      </w:r>
-      <w:r>
-        <w:rPr>
-          <w:rFonts w:ascii="Times New Roman" w:hAnsi="Times New Roman" w:cs="Times New Roman"/>
-          <w:sz w:val="18"/>
-          <w:szCs w:val="18"/>
-          <w:highlight w:val="yellow"/>
-        </w:rPr>
-        <w:t>0</w:t>
-      </w:r>
-      <w:r>
-        <w:rPr>
-          <w:rFonts w:ascii="Times New Roman" w:hAnsi="Times New Roman" w:cs="Times New Roman"/>
-          <w:sz w:val="18"/>
-          <w:szCs w:val="18"/>
-          <w:highlight w:val="yellow"/>
-        </w:rPr>
-        <w:t>. Legenda.</w:t>
-      </w:r>
-    </w:p>
-    <w:p>
-      <w:pPr>
-        <w:rPr>
-          <w:rFonts w:ascii="Times New Roman" w:hAnsi="Times New Roman" w:cs="Times New Roman"/>
-          <w:b/>
-          <w:bCs/>
-          <w:sz w:val="24"/>
-          <w:szCs w:val="24"/>
-          <w:highlight w:val="yellow"/>
-        </w:rPr>
-      </w:pPr>
-      <w:r>
-        <w:rPr>
-          <w:rFonts w:ascii="Times New Roman" w:hAnsi="Times New Roman" w:cs="Times New Roman"/>
-          <w:b/>
-          <w:bCs/>
-          <w:sz w:val="24"/>
-          <w:szCs w:val="24"/>
-          <w:highlight w:val="yellow"/>
-        </w:rPr>
-        <w:t>4</w:t>
-      </w:r>
-      <w:r>
-        <w:rPr>
-          <w:rFonts w:ascii="Times New Roman" w:hAnsi="Times New Roman" w:cs="Times New Roman"/>
-          <w:b/>
-          <w:bCs/>
-          <w:sz w:val="24"/>
-          <w:szCs w:val="24"/>
-          <w:highlight w:val="yellow"/>
-        </w:rPr>
-        <w:t>. c)</w:t>
-      </w:r>
-    </w:p>
-    <w:p>
-      <w:pPr>
-        <w:rPr>
-          <w:rFonts w:ascii="Times New Roman" w:hAnsi="Times New Roman" w:cs="Times New Roman"/>
-          <w:highlight w:val="yellow"/>
-        </w:rPr>
-      </w:pPr>
-      <w:r>
-        <w:rPr>
-          <w:rFonts w:ascii="Times New Roman" w:hAnsi="Times New Roman" w:cs="Times New Roman"/>
-          <w:highlight w:val="yellow"/>
-        </w:rPr>
-        <w:t>INTRODUÇÃO</w:t>
-      </w:r>
-    </w:p>
-    <w:p>
-      <w:pPr>
-        <w:rPr>
-          <w:rFonts w:ascii="Times New Roman" w:hAnsi="Times New Roman" w:cs="Times New Roman"/>
-          <w:highlight w:val="yellow"/>
-        </w:rPr>
-      </w:pPr>
-      <w:r>
-        <w:rPr>
-          <w:rFonts w:ascii="Times New Roman" w:hAnsi="Times New Roman" w:cs="Times New Roman"/>
-          <w:highlight w:val="yellow"/>
-        </w:rPr>
-        <w:t>X</w:t>
-      </w:r>
-    </w:p>
-    <w:p>
-      <w:pPr>
-        <w:rPr>
-          <w:rFonts w:ascii="Times New Roman" w:hAnsi="Times New Roman" w:cs="Times New Roman"/>
-          <w:sz w:val="18"/>
-          <w:szCs w:val="18"/>
-          <w:highlight w:val="yellow"/>
-        </w:rPr>
-      </w:pPr>
-      <w:r>
-        <w:rPr>
-          <w:rFonts w:ascii="Times New Roman" w:hAnsi="Times New Roman" w:cs="Times New Roman"/>
-          <w:sz w:val="18"/>
-          <w:szCs w:val="18"/>
-          <w:highlight w:val="yellow"/>
-        </w:rPr>
-        <w:t xml:space="preserve">Figura </w:t>
-      </w:r>
-      <w:r>
-        <w:rPr>
-          <w:rFonts w:ascii="Times New Roman" w:hAnsi="Times New Roman" w:cs="Times New Roman"/>
-          <w:sz w:val="18"/>
-          <w:szCs w:val="18"/>
-          <w:highlight w:val="yellow"/>
-        </w:rPr>
-        <w:t>1</w:t>
-      </w:r>
-      <w:r>
-        <w:rPr>
-          <w:rFonts w:ascii="Times New Roman" w:hAnsi="Times New Roman" w:cs="Times New Roman"/>
-          <w:sz w:val="18"/>
-          <w:szCs w:val="18"/>
-          <w:highlight w:val="yellow"/>
-        </w:rPr>
-        <w:t>1</w:t>
-      </w:r>
-      <w:r>
-        <w:rPr>
-          <w:rFonts w:ascii="Times New Roman" w:hAnsi="Times New Roman" w:cs="Times New Roman"/>
-          <w:sz w:val="18"/>
-          <w:szCs w:val="18"/>
-          <w:highlight w:val="yellow"/>
-        </w:rPr>
-        <w:t>. Legenda.</w:t>
-      </w:r>
-    </w:p>
-    <w:p>
-      <w:pPr>
-        <w:rPr>
-          <w:rFonts w:ascii="Times New Roman" w:hAnsi="Times New Roman" w:cs="Times New Roman"/>
-          <w:sz w:val="18"/>
-          <w:szCs w:val="18"/>
-          <w:highlight w:val="yellow"/>
-        </w:rPr>
-      </w:pPr>
-    </w:p>
-    <w:p>
-      <w:pPr>
-        <w:rPr>
-          <w:rFonts w:ascii="Times New Roman" w:hAnsi="Times New Roman" w:cs="Times New Roman"/>
-          <w:b/>
-          <w:bCs/>
+          <w:b w:val="0"/>
+          <w:bCs w:val="0"/>
+          <w:sz w:val="22"/>
+          <w:szCs w:val="22"/>
+        </w:rPr>
+      </w:pPr>
+      <w:r>
+        <w:rPr>
+          <w:rFonts w:ascii="Times New Roman" w:hAnsi="Times New Roman" w:cs="Times New Roman"/>
+          <w:b w:val="0"/>
+          <w:bCs w:val="0"/>
+          <w:sz w:val="22"/>
+          <w:szCs w:val="22"/>
+        </w:rPr>
+        <w:t>All</w:t>
+      </w:r>
+      <w:r>
+        <w:rPr>
+          <w:rFonts w:ascii="Times New Roman" w:hAnsi="Times New Roman" w:cs="Times New Roman"/>
+          <w:b w:val="0"/>
+          <w:bCs w:val="0"/>
+          <w:sz w:val="22"/>
+          <w:szCs w:val="22"/>
+        </w:rPr>
+        <w:t xml:space="preserve"> </w:t>
+      </w:r>
+      <w:r>
+        <w:rPr>
+          <w:rFonts w:ascii="Times New Roman" w:hAnsi="Times New Roman" w:cs="Times New Roman"/>
+          <w:b w:val="0"/>
+          <w:bCs w:val="0"/>
+          <w:sz w:val="22"/>
+          <w:szCs w:val="22"/>
+        </w:rPr>
+        <w:t>the</w:t>
+      </w:r>
+      <w:r>
+        <w:rPr>
+          <w:rFonts w:ascii="Times New Roman" w:hAnsi="Times New Roman" w:cs="Times New Roman"/>
+          <w:b w:val="0"/>
+          <w:bCs w:val="0"/>
+          <w:sz w:val="22"/>
+          <w:szCs w:val="22"/>
+        </w:rPr>
+        <w:t xml:space="preserve"> </w:t>
+      </w:r>
+      <w:r>
+        <w:rPr>
+          <w:rFonts w:ascii="Times New Roman" w:hAnsi="Times New Roman" w:cs="Times New Roman"/>
+          <w:b w:val="0"/>
+          <w:bCs w:val="0"/>
+          <w:sz w:val="22"/>
+          <w:szCs w:val="22"/>
+        </w:rPr>
+        <w:t>remaining</w:t>
+      </w:r>
+      <w:r>
+        <w:rPr>
+          <w:rFonts w:ascii="Times New Roman" w:hAnsi="Times New Roman" w:cs="Times New Roman"/>
+          <w:b w:val="0"/>
+          <w:bCs w:val="0"/>
+          <w:sz w:val="22"/>
+          <w:szCs w:val="22"/>
+        </w:rPr>
+        <w:t xml:space="preserve"> </w:t>
+      </w:r>
+      <w:r>
+        <w:rPr>
+          <w:rFonts w:ascii="Times New Roman" w:hAnsi="Times New Roman" w:cs="Times New Roman"/>
+          <w:b w:val="0"/>
+          <w:bCs w:val="0"/>
+          <w:sz w:val="22"/>
+          <w:szCs w:val="22"/>
+        </w:rPr>
+        <w:t>methods</w:t>
+      </w:r>
+      <w:r>
+        <w:rPr>
+          <w:rFonts w:ascii="Times New Roman" w:hAnsi="Times New Roman" w:cs="Times New Roman"/>
+          <w:b w:val="0"/>
+          <w:bCs w:val="0"/>
+          <w:sz w:val="22"/>
+          <w:szCs w:val="22"/>
+        </w:rPr>
+        <w:t xml:space="preserve"> </w:t>
+      </w:r>
+      <w:r>
+        <w:rPr>
+          <w:rFonts w:ascii="Times New Roman" w:hAnsi="Times New Roman" w:cs="Times New Roman"/>
+          <w:b w:val="0"/>
+          <w:bCs w:val="0"/>
+          <w:sz w:val="22"/>
+          <w:szCs w:val="22"/>
+        </w:rPr>
+        <w:t>were</w:t>
+      </w:r>
+      <w:r>
+        <w:rPr>
+          <w:rFonts w:ascii="Times New Roman" w:hAnsi="Times New Roman" w:cs="Times New Roman"/>
+          <w:b w:val="0"/>
+          <w:bCs w:val="0"/>
+          <w:sz w:val="22"/>
+          <w:szCs w:val="22"/>
+        </w:rPr>
+        <w:t xml:space="preserve"> </w:t>
+      </w:r>
+      <w:r>
+        <w:rPr>
+          <w:rFonts w:ascii="Times New Roman" w:hAnsi="Times New Roman" w:cs="Times New Roman"/>
+          <w:b w:val="0"/>
+          <w:bCs w:val="0"/>
+          <w:sz w:val="22"/>
+          <w:szCs w:val="22"/>
+        </w:rPr>
+        <w:t>implemented</w:t>
+      </w:r>
+      <w:r>
+        <w:rPr>
+          <w:rFonts w:ascii="Times New Roman" w:hAnsi="Times New Roman" w:cs="Times New Roman"/>
+          <w:b w:val="0"/>
+          <w:bCs w:val="0"/>
+          <w:sz w:val="22"/>
+          <w:szCs w:val="22"/>
+        </w:rPr>
+        <w:t xml:space="preserve"> </w:t>
+      </w:r>
+      <w:r>
+        <w:rPr>
+          <w:rFonts w:ascii="Times New Roman" w:hAnsi="Times New Roman" w:cs="Times New Roman"/>
+          <w:b w:val="0"/>
+          <w:bCs w:val="0"/>
+          <w:sz w:val="22"/>
+          <w:szCs w:val="22"/>
+        </w:rPr>
+        <w:t>and</w:t>
+      </w:r>
+      <w:r>
+        <w:rPr>
+          <w:rFonts w:ascii="Times New Roman" w:hAnsi="Times New Roman" w:cs="Times New Roman"/>
+          <w:b w:val="0"/>
+          <w:bCs w:val="0"/>
+          <w:sz w:val="22"/>
+          <w:szCs w:val="22"/>
+        </w:rPr>
+        <w:t xml:space="preserve"> can </w:t>
+      </w:r>
+      <w:r>
+        <w:rPr>
+          <w:rFonts w:ascii="Times New Roman" w:hAnsi="Times New Roman" w:cs="Times New Roman"/>
+          <w:b w:val="0"/>
+          <w:bCs w:val="0"/>
+          <w:sz w:val="22"/>
+          <w:szCs w:val="22"/>
+        </w:rPr>
+        <w:t>be</w:t>
+      </w:r>
+      <w:r>
+        <w:rPr>
+          <w:rFonts w:ascii="Times New Roman" w:hAnsi="Times New Roman" w:cs="Times New Roman"/>
+          <w:b w:val="0"/>
+          <w:bCs w:val="0"/>
+          <w:sz w:val="22"/>
+          <w:szCs w:val="22"/>
+        </w:rPr>
+        <w:t xml:space="preserve"> </w:t>
+      </w:r>
+      <w:r>
+        <w:rPr>
+          <w:rFonts w:ascii="Times New Roman" w:hAnsi="Times New Roman" w:cs="Times New Roman"/>
+          <w:b w:val="0"/>
+          <w:bCs w:val="0"/>
+          <w:sz w:val="22"/>
+          <w:szCs w:val="22"/>
+        </w:rPr>
+        <w:t>seen</w:t>
+      </w:r>
+      <w:r>
+        <w:rPr>
+          <w:rFonts w:ascii="Times New Roman" w:hAnsi="Times New Roman" w:cs="Times New Roman"/>
+          <w:b w:val="0"/>
+          <w:bCs w:val="0"/>
+          <w:sz w:val="22"/>
+          <w:szCs w:val="22"/>
+        </w:rPr>
+        <w:t xml:space="preserve"> </w:t>
+      </w:r>
+      <w:r>
+        <w:rPr>
+          <w:rFonts w:ascii="Times New Roman" w:hAnsi="Times New Roman" w:cs="Times New Roman"/>
+          <w:b w:val="0"/>
+          <w:bCs w:val="0"/>
+          <w:sz w:val="22"/>
+          <w:szCs w:val="22"/>
+        </w:rPr>
+        <w:t xml:space="preserve">in </w:t>
+      </w:r>
+      <w:r>
+        <w:rPr>
+          <w:rFonts w:ascii="Times New Roman" w:hAnsi="Times New Roman" w:cs="Times New Roman"/>
+          <w:b w:val="0"/>
+          <w:bCs w:val="0"/>
+          <w:sz w:val="22"/>
+          <w:szCs w:val="22"/>
+        </w:rPr>
+        <w:t>the</w:t>
+      </w:r>
+      <w:r>
+        <w:rPr>
+          <w:rFonts w:ascii="Times New Roman" w:hAnsi="Times New Roman" w:cs="Times New Roman"/>
+          <w:b w:val="0"/>
+          <w:bCs w:val="0"/>
+          <w:sz w:val="22"/>
+          <w:szCs w:val="22"/>
+        </w:rPr>
+        <w:t xml:space="preserve"> </w:t>
+      </w:r>
+      <w:r>
+        <w:rPr>
+          <w:rFonts w:ascii="Times New Roman" w:hAnsi="Times New Roman" w:cs="Times New Roman"/>
+          <w:b w:val="0"/>
+          <w:bCs w:val="0"/>
+          <w:i w:val="1"/>
+          <w:iCs w:val="1"/>
+          <w:sz w:val="22"/>
+          <w:szCs w:val="22"/>
+        </w:rPr>
+        <w:t>my_split_and_eval.py</w:t>
+      </w:r>
+      <w:r>
+        <w:rPr>
+          <w:rFonts w:ascii="Times New Roman" w:hAnsi="Times New Roman" w:cs="Times New Roman"/>
+          <w:b w:val="0"/>
+          <w:bCs w:val="0"/>
+          <w:sz w:val="22"/>
+          <w:szCs w:val="22"/>
+        </w:rPr>
+        <w:t xml:space="preserve"> file.</w:t>
+      </w:r>
+    </w:p>
+    <w:p>
+      <w:pPr>
+        <w:spacing w:before="240" w:beforeAutospacing="off" w:after="240" w:afterAutospacing="off"/>
+      </w:pPr>
+      <w:r>
+        <w:rPr>
+          <w:rFonts w:ascii="Times New Roman" w:hAnsi="Times New Roman" w:eastAsia="Times New Roman" w:cs="Times New Roman"/>
+          <w:b w:val="1"/>
+          <w:bCs w:val="1"/>
+          <w:noProof w:val="0"/>
+          <w:sz w:val="24"/>
+          <w:szCs w:val="24"/>
+          <w:lang w:val="en-US"/>
+        </w:rPr>
+        <w:t>4. b)</w:t>
+      </w:r>
+      <w:r>
+        <w:br/>
+      </w:r>
+      <w:r>
+        <w:rPr>
+          <w:rFonts w:ascii="Times New Roman" w:hAnsi="Times New Roman" w:eastAsia="Times New Roman" w:cs="Times New Roman"/>
+          <w:noProof w:val="0"/>
+          <w:sz w:val="22"/>
+          <w:szCs w:val="22"/>
+          <w:lang w:val="en-US"/>
+        </w:rPr>
+        <w:t xml:space="preserve">The implemented methods cover a wide range of strategies — from exhaustive approaches, such as </w:t>
+      </w:r>
+      <w:r>
+        <w:rPr>
+          <w:rFonts w:ascii="Times New Roman" w:hAnsi="Times New Roman" w:eastAsia="Times New Roman" w:cs="Times New Roman"/>
+          <w:i w:val="1"/>
+          <w:iCs w:val="1"/>
+          <w:noProof w:val="0"/>
+          <w:sz w:val="22"/>
+          <w:szCs w:val="22"/>
+          <w:lang w:val="en-US"/>
+        </w:rPr>
+        <w:t>l</w:t>
+      </w:r>
+      <w:r>
+        <w:rPr>
+          <w:rFonts w:ascii="Times New Roman" w:hAnsi="Times New Roman" w:eastAsia="Times New Roman" w:cs="Times New Roman"/>
+          <w:i w:val="1"/>
+          <w:iCs w:val="1"/>
+          <w:noProof w:val="0"/>
+          <w:sz w:val="22"/>
+          <w:szCs w:val="22"/>
+          <w:lang w:val="en-US"/>
+        </w:rPr>
+        <w:t>eave_one_out</w:t>
+      </w:r>
+      <w:r>
+        <w:rPr>
+          <w:rFonts w:ascii="Times New Roman" w:hAnsi="Times New Roman" w:eastAsia="Times New Roman" w:cs="Times New Roman"/>
+          <w:noProof w:val="0"/>
+          <w:sz w:val="22"/>
+          <w:szCs w:val="22"/>
+          <w:lang w:val="en-US"/>
+        </w:rPr>
+        <w:t xml:space="preserve"> </w:t>
+      </w:r>
+      <w:r>
+        <w:rPr>
+          <w:rFonts w:ascii="Times New Roman" w:hAnsi="Times New Roman" w:eastAsia="Times New Roman" w:cs="Times New Roman"/>
+          <w:noProof w:val="0"/>
+          <w:sz w:val="22"/>
+          <w:szCs w:val="22"/>
+          <w:lang w:val="en-US"/>
+        </w:rPr>
+        <w:t xml:space="preserve">and </w:t>
+      </w:r>
+      <w:r>
+        <w:rPr>
+          <w:rFonts w:ascii="Times New Roman" w:hAnsi="Times New Roman" w:eastAsia="Times New Roman" w:cs="Times New Roman"/>
+          <w:i w:val="1"/>
+          <w:iCs w:val="1"/>
+          <w:noProof w:val="0"/>
+          <w:sz w:val="22"/>
+          <w:szCs w:val="22"/>
+          <w:lang w:val="en-US"/>
+        </w:rPr>
+        <w:t>l</w:t>
+      </w:r>
+      <w:r>
+        <w:rPr>
+          <w:rFonts w:ascii="Times New Roman" w:hAnsi="Times New Roman" w:eastAsia="Times New Roman" w:cs="Times New Roman"/>
+          <w:i w:val="1"/>
+          <w:iCs w:val="1"/>
+          <w:noProof w:val="0"/>
+          <w:sz w:val="22"/>
+          <w:szCs w:val="22"/>
+          <w:lang w:val="en-US"/>
+        </w:rPr>
+        <w:t>eave_p_out</w:t>
+      </w:r>
+      <w:r>
+        <w:rPr>
+          <w:rFonts w:ascii="Times New Roman" w:hAnsi="Times New Roman" w:eastAsia="Times New Roman" w:cs="Times New Roman"/>
+          <w:noProof w:val="0"/>
+          <w:sz w:val="22"/>
+          <w:szCs w:val="22"/>
+          <w:lang w:val="en-US"/>
+        </w:rPr>
+        <w:t>,</w:t>
+      </w:r>
+      <w:r>
+        <w:rPr>
+          <w:rFonts w:ascii="Times New Roman" w:hAnsi="Times New Roman" w:eastAsia="Times New Roman" w:cs="Times New Roman"/>
+          <w:noProof w:val="0"/>
+          <w:sz w:val="22"/>
+          <w:szCs w:val="22"/>
+          <w:lang w:val="en-US"/>
+        </w:rPr>
+        <w:t xml:space="preserve"> to techniques that create multiple splits with lower computational cost, like </w:t>
+      </w:r>
+      <w:r>
+        <w:rPr>
+          <w:rFonts w:ascii="Times New Roman" w:hAnsi="Times New Roman" w:eastAsia="Times New Roman" w:cs="Times New Roman"/>
+          <w:i w:val="1"/>
+          <w:iCs w:val="1"/>
+          <w:noProof w:val="0"/>
+          <w:sz w:val="22"/>
+          <w:szCs w:val="22"/>
+          <w:lang w:val="en-US"/>
+        </w:rPr>
+        <w:t>f</w:t>
+      </w:r>
+      <w:r>
+        <w:rPr>
+          <w:rFonts w:ascii="Times New Roman" w:hAnsi="Times New Roman" w:eastAsia="Times New Roman" w:cs="Times New Roman"/>
+          <w:i w:val="1"/>
+          <w:iCs w:val="1"/>
+          <w:noProof w:val="0"/>
+          <w:sz w:val="22"/>
+          <w:szCs w:val="22"/>
+          <w:lang w:val="en-US"/>
+        </w:rPr>
+        <w:t>old_split</w:t>
+      </w:r>
+      <w:r>
+        <w:rPr>
+          <w:rFonts w:ascii="Times New Roman" w:hAnsi="Times New Roman" w:eastAsia="Times New Roman" w:cs="Times New Roman"/>
+          <w:noProof w:val="0"/>
+          <w:sz w:val="22"/>
+          <w:szCs w:val="22"/>
+          <w:lang w:val="en-US"/>
+        </w:rPr>
+        <w:t xml:space="preserve"> </w:t>
+      </w:r>
+      <w:r>
+        <w:rPr>
+          <w:rFonts w:ascii="Times New Roman" w:hAnsi="Times New Roman" w:eastAsia="Times New Roman" w:cs="Times New Roman"/>
+          <w:noProof w:val="0"/>
+          <w:sz w:val="22"/>
+          <w:szCs w:val="22"/>
+          <w:lang w:val="en-US"/>
+        </w:rPr>
+        <w:t xml:space="preserve">and </w:t>
+      </w:r>
+      <w:r>
+        <w:rPr>
+          <w:rFonts w:ascii="Times New Roman" w:hAnsi="Times New Roman" w:eastAsia="Times New Roman" w:cs="Times New Roman"/>
+          <w:i w:val="1"/>
+          <w:iCs w:val="1"/>
+          <w:noProof w:val="0"/>
+          <w:sz w:val="22"/>
+          <w:szCs w:val="22"/>
+          <w:lang w:val="en-US"/>
+        </w:rPr>
+        <w:t>b</w:t>
+      </w:r>
+      <w:r>
+        <w:rPr>
+          <w:rFonts w:ascii="Times New Roman" w:hAnsi="Times New Roman" w:eastAsia="Times New Roman" w:cs="Times New Roman"/>
+          <w:i w:val="1"/>
+          <w:iCs w:val="1"/>
+          <w:noProof w:val="0"/>
+          <w:sz w:val="22"/>
+          <w:szCs w:val="22"/>
+          <w:lang w:val="en-US"/>
+        </w:rPr>
+        <w:t>ootstrap_split_once</w:t>
+      </w:r>
+      <w:r>
+        <w:rPr>
+          <w:rFonts w:ascii="Times New Roman" w:hAnsi="Times New Roman" w:eastAsia="Times New Roman" w:cs="Times New Roman"/>
+          <w:noProof w:val="0"/>
+          <w:sz w:val="22"/>
+          <w:szCs w:val="22"/>
+          <w:lang w:val="en-US"/>
+        </w:rPr>
+        <w:t>.</w:t>
+      </w:r>
+      <w:r>
+        <w:rPr>
+          <w:rFonts w:ascii="Times New Roman" w:hAnsi="Times New Roman" w:eastAsia="Times New Roman" w:cs="Times New Roman"/>
+          <w:noProof w:val="0"/>
+          <w:sz w:val="22"/>
+          <w:szCs w:val="22"/>
+          <w:lang w:val="en-US"/>
+        </w:rPr>
+        <w:t xml:space="preserve"> Each method serves a different purpose, so </w:t>
+      </w:r>
+      <w:r>
+        <w:rPr>
+          <w:rFonts w:ascii="Times New Roman" w:hAnsi="Times New Roman" w:eastAsia="Times New Roman" w:cs="Times New Roman"/>
+          <w:noProof w:val="0"/>
+          <w:sz w:val="22"/>
+          <w:szCs w:val="22"/>
+          <w:lang w:val="en-US"/>
+        </w:rPr>
+        <w:t>i</w:t>
+      </w:r>
+      <w:r>
+        <w:rPr>
+          <w:rFonts w:ascii="Times New Roman" w:hAnsi="Times New Roman" w:eastAsia="Times New Roman" w:cs="Times New Roman"/>
+          <w:noProof w:val="0"/>
+          <w:sz w:val="22"/>
+          <w:szCs w:val="22"/>
+          <w:lang w:val="en-US"/>
+        </w:rPr>
+        <w:t>t’s</w:t>
+      </w:r>
+      <w:r>
+        <w:rPr>
+          <w:rFonts w:ascii="Times New Roman" w:hAnsi="Times New Roman" w:eastAsia="Times New Roman" w:cs="Times New Roman"/>
+          <w:noProof w:val="0"/>
+          <w:sz w:val="22"/>
+          <w:szCs w:val="22"/>
+          <w:lang w:val="en-US"/>
+        </w:rPr>
+        <w:t xml:space="preserve"> </w:t>
+      </w:r>
+      <w:r>
+        <w:rPr>
+          <w:rFonts w:ascii="Times New Roman" w:hAnsi="Times New Roman" w:eastAsia="Times New Roman" w:cs="Times New Roman"/>
+          <w:noProof w:val="0"/>
+          <w:sz w:val="22"/>
+          <w:szCs w:val="22"/>
+          <w:lang w:val="en-US"/>
+        </w:rPr>
+        <w:t>important to consider which one is most suitable for the specific situation.</w:t>
+      </w:r>
+    </w:p>
+    <w:p>
+      <w:pPr>
+        <w:spacing w:before="240" w:beforeAutospacing="off" w:after="240" w:afterAutospacing="off"/>
+      </w:pPr>
+      <w:r>
+        <w:rPr>
+          <w:rFonts w:ascii="Times New Roman" w:hAnsi="Times New Roman" w:eastAsia="Times New Roman" w:cs="Times New Roman"/>
+          <w:b w:val="1"/>
+          <w:bCs w:val="1"/>
+          <w:noProof w:val="0"/>
+          <w:sz w:val="24"/>
+          <w:szCs w:val="24"/>
+          <w:lang w:val="en-US"/>
+        </w:rPr>
+        <w:t>4. c)</w:t>
+      </w:r>
+      <w:r>
+        <w:br/>
+      </w:r>
+      <w:r>
+        <w:rPr>
+          <w:rFonts w:ascii="Times New Roman" w:hAnsi="Times New Roman" w:eastAsia="Times New Roman" w:cs="Times New Roman"/>
+          <w:noProof w:val="0"/>
+          <w:sz w:val="22"/>
+          <w:szCs w:val="22"/>
+          <w:lang w:val="en-US"/>
+        </w:rPr>
+        <w:t xml:space="preserve">The functions produced varying classification outcomes: some delivered </w:t>
+      </w:r>
+      <w:r>
+        <w:rPr>
+          <w:rFonts w:ascii="Times New Roman" w:hAnsi="Times New Roman" w:eastAsia="Times New Roman" w:cs="Times New Roman"/>
+          <w:noProof w:val="0"/>
+          <w:sz w:val="22"/>
+          <w:szCs w:val="22"/>
+          <w:lang w:val="en-US"/>
+        </w:rPr>
+        <w:t>accurate</w:t>
+      </w:r>
+      <w:r>
+        <w:rPr>
+          <w:rFonts w:ascii="Times New Roman" w:hAnsi="Times New Roman" w:eastAsia="Times New Roman" w:cs="Times New Roman"/>
+          <w:noProof w:val="0"/>
+          <w:sz w:val="22"/>
+          <w:szCs w:val="22"/>
+          <w:lang w:val="en-US"/>
+        </w:rPr>
+        <w:t xml:space="preserve"> splits, while others did not perform as well. Certain approaches proved incompatible with this dataset — for example, </w:t>
+      </w:r>
+      <w:r>
+        <w:rPr>
+          <w:rFonts w:ascii="Times New Roman" w:hAnsi="Times New Roman" w:eastAsia="Times New Roman" w:cs="Times New Roman"/>
+          <w:i w:val="1"/>
+          <w:iCs w:val="1"/>
+          <w:noProof w:val="0"/>
+          <w:sz w:val="22"/>
+          <w:szCs w:val="22"/>
+          <w:lang w:val="en-US"/>
+        </w:rPr>
+        <w:t>leave_one_out</w:t>
+      </w:r>
+      <w:r>
+        <w:rPr>
+          <w:rFonts w:ascii="Times New Roman" w:hAnsi="Times New Roman" w:eastAsia="Times New Roman" w:cs="Times New Roman"/>
+          <w:noProof w:val="0"/>
+          <w:sz w:val="22"/>
+          <w:szCs w:val="22"/>
+          <w:lang w:val="en-US"/>
+        </w:rPr>
+        <w:t xml:space="preserve"> and </w:t>
+      </w:r>
+      <w:r>
+        <w:rPr>
+          <w:rFonts w:ascii="Times New Roman" w:hAnsi="Times New Roman" w:eastAsia="Times New Roman" w:cs="Times New Roman"/>
+          <w:i w:val="1"/>
+          <w:iCs w:val="1"/>
+          <w:noProof w:val="0"/>
+          <w:sz w:val="22"/>
+          <w:szCs w:val="22"/>
+          <w:lang w:val="en-US"/>
+        </w:rPr>
+        <w:t>leave_p_out</w:t>
+      </w:r>
+      <w:r>
+        <w:rPr>
+          <w:rFonts w:ascii="Times New Roman" w:hAnsi="Times New Roman" w:eastAsia="Times New Roman" w:cs="Times New Roman"/>
+          <w:noProof w:val="0"/>
+          <w:sz w:val="22"/>
+          <w:szCs w:val="22"/>
+          <w:lang w:val="en-US"/>
+        </w:rPr>
+        <w:t xml:space="preserve"> ended up in an infinite loop, preventing us from obtaining any classification results.</w:t>
+      </w:r>
+    </w:p>
+    <w:p>
+      <w:pPr>
+        <w:rPr>
+          <w:rFonts w:ascii="Times New Roman" w:hAnsi="Times New Roman" w:cs="Times New Roman"/>
+          <w:sz w:val="18"/>
+          <w:szCs w:val="18"/>
+          <w:highlight w:val="yellow"/>
+        </w:rPr>
+      </w:pPr>
+    </w:p>
+    <w:p w14:noSpellErr="1">
+      <w:pPr>
+        <w:rPr>
+          <w:rFonts w:ascii="Times New Roman" w:hAnsi="Times New Roman" w:cs="Times New Roman"/>
+          <w:sz w:val="18"/>
+          <w:szCs w:val="18"/>
+          <w:highlight w:val="yellow"/>
+        </w:rPr>
+      </w:pPr>
+    </w:p>
+    <w:p>
+      <w:pPr>
+        <w:rPr>
+          <w:rFonts w:ascii="Times New Roman" w:hAnsi="Times New Roman" w:cs="Times New Roman"/>
+          <w:sz w:val="18"/>
+          <w:szCs w:val="18"/>
+          <w:highlight w:val="yellow"/>
+        </w:rPr>
+      </w:pPr>
+    </w:p>
+    <w:p>
+      <w:pPr>
+        <w:rPr>
+          <w:rFonts w:ascii="Times New Roman" w:hAnsi="Times New Roman" w:cs="Times New Roman"/>
+          <w:sz w:val="18"/>
+          <w:szCs w:val="18"/>
+          <w:highlight w:val="yellow"/>
+        </w:rPr>
+      </w:pPr>
+    </w:p>
+    <w:p>
+      <w:pPr>
+        <w:rPr>
+          <w:rFonts w:ascii="Times New Roman" w:hAnsi="Times New Roman" w:cs="Times New Roman"/>
+          <w:sz w:val="18"/>
+          <w:szCs w:val="18"/>
+          <w:highlight w:val="yellow"/>
+        </w:rPr>
+      </w:pPr>
+    </w:p>
+    <w:p>
+      <w:pPr>
+        <w:rPr>
+          <w:rFonts w:ascii="Times New Roman" w:hAnsi="Times New Roman" w:cs="Times New Roman"/>
+          <w:b w:val="1"/>
+          <w:bCs w:val="1"/>
           <w:sz w:val="28"/>
           <w:szCs w:val="28"/>
-          <w:highlight w:val="yellow"/>
-        </w:rPr>
-      </w:pPr>
-      <w:r>
-        <w:rPr>
-          <w:rFonts w:ascii="Times New Roman" w:hAnsi="Times New Roman" w:cs="Times New Roman"/>
-          <w:b/>
-          <w:bCs/>
+        </w:rPr>
+      </w:pPr>
+      <w:r>
+        <w:rPr>
+          <w:rFonts w:ascii="Times New Roman" w:hAnsi="Times New Roman" w:cs="Times New Roman"/>
+          <w:b w:val="1"/>
+          <w:bCs w:val="1"/>
           <w:sz w:val="28"/>
           <w:szCs w:val="28"/>
-          <w:highlight w:val="yellow"/>
         </w:rPr>
         <w:t>5</w:t>
       </w:r>
       <w:r>
         <w:rPr>
           <w:rFonts w:ascii="Times New Roman" w:hAnsi="Times New Roman" w:cs="Times New Roman"/>
-          <w:b/>
-          <w:bCs/>
+          <w:b w:val="1"/>
+          <w:bCs w:val="1"/>
           <w:sz w:val="28"/>
           <w:szCs w:val="28"/>
-          <w:highlight w:val="yellow"/>
         </w:rPr>
         <w:t xml:space="preserve">. Análise e implementação </w:t>
       </w:r>
-      <w:proofErr w:type="spellStart"/>
-      <w:r>
-        <w:rPr>
-          <w:rFonts w:ascii="Times New Roman" w:hAnsi="Times New Roman" w:cs="Times New Roman"/>
-          <w:b/>
-          <w:bCs/>
-          <w:i/>
-          <w:iCs/>
+      <w:r>
+        <w:rPr>
+          <w:rFonts w:ascii="Times New Roman" w:hAnsi="Times New Roman" w:cs="Times New Roman"/>
+          <w:b w:val="1"/>
+          <w:bCs w:val="1"/>
+          <w:i w:val="1"/>
+          <w:iCs w:val="1"/>
           <w:sz w:val="28"/>
           <w:szCs w:val="28"/>
-          <w:highlight w:val="yellow"/>
         </w:rPr>
         <w:t>bootstrap</w:t>
       </w:r>
-      <w:proofErr w:type="spellEnd"/>
-    </w:p>
-    <w:p>
-      <w:pPr>
-        <w:rPr>
-          <w:rFonts w:ascii="Times New Roman" w:hAnsi="Times New Roman" w:cs="Times New Roman"/>
-          <w:highlight w:val="yellow"/>
-        </w:rPr>
-      </w:pPr>
-      <w:r>
-        <w:rPr>
-          <w:rFonts w:ascii="Times New Roman" w:hAnsi="Times New Roman" w:cs="Times New Roman"/>
-          <w:highlight w:val="yellow"/>
+    </w:p>
+    <w:p>
+      <w:pPr>
+        <w:rPr>
+          <w:rFonts w:ascii="Times New Roman" w:hAnsi="Times New Roman" w:cs="Times New Roman"/>
+        </w:rPr>
+      </w:pPr>
+      <w:r>
+        <w:rPr>
+          <w:rFonts w:ascii="Times New Roman" w:hAnsi="Times New Roman" w:cs="Times New Roman"/>
         </w:rPr>
         <w:t xml:space="preserve">Analisamos o método </w:t>
       </w:r>
-      <w:proofErr w:type="spellStart"/>
-      <w:r>
-        <w:rPr>
-          <w:rFonts w:ascii="Times New Roman" w:hAnsi="Times New Roman" w:cs="Times New Roman"/>
-          <w:i/>
-          <w:iCs/>
-          <w:highlight w:val="yellow"/>
+      <w:r>
+        <w:rPr>
+          <w:rFonts w:ascii="Times New Roman" w:hAnsi="Times New Roman" w:cs="Times New Roman"/>
+          <w:i w:val="1"/>
+          <w:iCs w:val="1"/>
         </w:rPr>
         <w:t>bootstrap</w:t>
       </w:r>
-      <w:proofErr w:type="spellEnd"/>
-      <w:r>
-        <w:rPr>
-          <w:rFonts w:ascii="Times New Roman" w:hAnsi="Times New Roman" w:cs="Times New Roman"/>
-          <w:highlight w:val="yellow"/>
+      <w:r>
+        <w:rPr>
+          <w:rFonts w:ascii="Times New Roman" w:hAnsi="Times New Roman" w:cs="Times New Roman"/>
         </w:rPr>
         <w:t xml:space="preserve"> e corrigimos a implementação incompleta fornecida.</w:t>
       </w:r>
     </w:p>
-    <w:p>
-      <w:pPr>
-        <w:rPr>
-          <w:rFonts w:ascii="Times New Roman" w:hAnsi="Times New Roman" w:cs="Times New Roman"/>
-          <w:b/>
-          <w:bCs/>
-          <w:sz w:val="24"/>
-          <w:szCs w:val="24"/>
-          <w:highlight w:val="yellow"/>
-        </w:rPr>
-      </w:pPr>
-      <w:r>
-        <w:rPr>
-          <w:rFonts w:ascii="Times New Roman" w:hAnsi="Times New Roman" w:cs="Times New Roman"/>
-          <w:b/>
-          <w:bCs/>
-          <w:sz w:val="24"/>
-          <w:szCs w:val="24"/>
-          <w:highlight w:val="yellow"/>
+    <w:p w14:noSpellErr="1">
+      <w:pPr>
+        <w:rPr>
+          <w:rFonts w:ascii="Times New Roman" w:hAnsi="Times New Roman" w:cs="Times New Roman"/>
+          <w:b w:val="1"/>
+          <w:bCs w:val="1"/>
+          <w:sz w:val="24"/>
+          <w:szCs w:val="24"/>
+        </w:rPr>
+      </w:pPr>
+      <w:r>
+        <w:rPr>
+          <w:rFonts w:ascii="Times New Roman" w:hAnsi="Times New Roman" w:cs="Times New Roman"/>
+          <w:b w:val="1"/>
+          <w:bCs w:val="1"/>
+          <w:sz w:val="24"/>
+          <w:szCs w:val="24"/>
         </w:rPr>
         <w:t>5</w:t>
       </w:r>
       <w:r>
         <w:rPr>
           <w:rFonts w:ascii="Times New Roman" w:hAnsi="Times New Roman" w:cs="Times New Roman"/>
-          <w:b/>
-          <w:bCs/>
-          <w:sz w:val="24"/>
-          <w:szCs w:val="24"/>
-          <w:highlight w:val="yellow"/>
+          <w:b w:val="1"/>
+          <w:bCs w:val="1"/>
+          <w:sz w:val="24"/>
+          <w:szCs w:val="24"/>
         </w:rPr>
         <w:t>. a)</w:t>
       </w:r>
@@ -3601,53 +3876,100 @@
       <w:pPr>
         <w:rPr>
           <w:rFonts w:ascii="Times New Roman" w:hAnsi="Times New Roman" w:cs="Times New Roman"/>
-          <w:highlight w:val="yellow"/>
-        </w:rPr>
-      </w:pPr>
-      <w:r>
-        <w:rPr>
-          <w:rFonts w:ascii="Times New Roman" w:hAnsi="Times New Roman" w:cs="Times New Roman"/>
-          <w:highlight w:val="yellow"/>
-        </w:rPr>
-        <w:t>INTRODUÇÃO</w:t>
-      </w:r>
-    </w:p>
-    <w:p>
-      <w:pPr>
-        <w:rPr>
-          <w:rFonts w:ascii="Times New Roman" w:hAnsi="Times New Roman" w:cs="Times New Roman"/>
-          <w:sz w:val="18"/>
-          <w:szCs w:val="18"/>
-          <w:highlight w:val="yellow"/>
-        </w:rPr>
-      </w:pPr>
-      <w:r>
-        <w:rPr>
-          <w:rFonts w:ascii="Times New Roman" w:hAnsi="Times New Roman" w:cs="Times New Roman"/>
-          <w:sz w:val="18"/>
-          <w:szCs w:val="18"/>
-          <w:highlight w:val="yellow"/>
-        </w:rPr>
-        <w:t>X</w:t>
-      </w:r>
-    </w:p>
-    <w:p>
-      <w:pPr>
-        <w:rPr>
-          <w:rFonts w:ascii="Times New Roman" w:hAnsi="Times New Roman" w:cs="Times New Roman"/>
-          <w:sz w:val="18"/>
-          <w:szCs w:val="18"/>
-          <w:highlight w:val="yellow"/>
-        </w:rPr>
-      </w:pPr>
-      <w:r>
-        <w:rPr>
-          <w:rFonts w:ascii="Times New Roman" w:hAnsi="Times New Roman" w:cs="Times New Roman"/>
-          <w:sz w:val="18"/>
-          <w:szCs w:val="18"/>
-          <w:highlight w:val="yellow"/>
-        </w:rPr>
-        <w:lastRenderedPageBreak/>
+          <w:sz w:val="22"/>
+          <w:szCs w:val="22"/>
+          <w:lang w:val="en-US"/>
+        </w:rPr>
+      </w:pPr>
+      <w:r>
+        <w:rPr>
+          <w:rFonts w:ascii="Times New Roman" w:hAnsi="Times New Roman" w:cs="Times New Roman"/>
+          <w:sz w:val="22"/>
+          <w:szCs w:val="22"/>
+          <w:lang w:val="en-US"/>
+        </w:rPr>
+        <w:t xml:space="preserve">We are using </w:t>
+      </w:r>
+      <w:r>
+        <w:rPr>
+          <w:rFonts w:ascii="Times New Roman" w:hAnsi="Times New Roman" w:cs="Times New Roman"/>
+          <w:sz w:val="22"/>
+          <w:szCs w:val="22"/>
+          <w:lang w:val="en-US"/>
+        </w:rPr>
+        <w:t>VSCode</w:t>
+      </w:r>
+      <w:r>
+        <w:rPr>
+          <w:rFonts w:ascii="Times New Roman" w:hAnsi="Times New Roman" w:cs="Times New Roman"/>
+          <w:sz w:val="22"/>
+          <w:szCs w:val="22"/>
+          <w:lang w:val="en-US"/>
+        </w:rPr>
+        <w:t xml:space="preserve"> instead of IDLE and got the following prompt:</w:t>
+      </w:r>
+    </w:p>
+    <w:p>
+      <w:pPr>
+        <w:pStyle w:val="Normal"/>
+        <w:jc w:val="center"/>
+        <w:rPr>
+          <w:rFonts w:ascii="Times New Roman" w:hAnsi="Times New Roman" w:cs="Times New Roman"/>
+          <w:sz w:val="18"/>
+          <w:szCs w:val="18"/>
+          <w:lang w:val="en-US"/>
+        </w:rPr>
+      </w:pPr>
+      <w:r>
+        <w:drawing>
+          <wp:inline wp14:editId="067B38E1" wp14:anchorId="2AC58D95">
+            <wp:extent cx="5400675" cy="1304925"/>
+            <wp:effectExtent l="0" t="0" r="0" b="0"/>
+            <wp:docPr id="144786010" name="drawing"/>
+            <wp:cNvGraphicFramePr>
+              <a:graphicFrameLocks noChangeAspect="1"/>
+            </wp:cNvGraphicFramePr>
+            <a:graphic>
+              <a:graphicData xmlns:a="http://schemas.openxmlformats.org/drawingml/2006/main" uri="http://schemas.openxmlformats.org/drawingml/2006/picture">
+                <pic:pic xmlns:pic="http://schemas.openxmlformats.org/drawingml/2006/picture">
+                  <pic:nvPicPr>
+                    <pic:cNvPr id="144786010" name="Picture 144786010"/>
+                    <pic:cNvPicPr/>
+                  </pic:nvPicPr>
+                  <pic:blipFill>
+                    <a:blip xmlns:r="http://schemas.openxmlformats.org/officeDocument/2006/relationships" r:embed="rId1634394299">
+                      <a:extLst>
+                        <a:ext uri="{28A0092B-C50C-407E-A947-70E740481C1C}">
+                          <a14:useLocalDpi xmlns:a14="http://schemas.microsoft.com/office/drawing/2010/main"/>
+                        </a:ext>
+                      </a:extLst>
+                    </a:blip>
+                    <a:stretch>
+                      <a:fillRect/>
+                    </a:stretch>
+                  </pic:blipFill>
+                  <pic:spPr>
+                    <a:xfrm>
+                      <a:off x="0" y="0"/>
+                      <a:ext cx="5400675" cy="1304925"/>
+                    </a:xfrm>
+                    <a:prstGeom prst="rect">
+                      <a:avLst/>
+                    </a:prstGeom>
+                  </pic:spPr>
+                </pic:pic>
+              </a:graphicData>
+            </a:graphic>
+          </wp:inline>
+        </w:drawing>
+      </w:r>
+      <w:r>
+        <w:rPr>
+          <w:rFonts w:ascii="Times New Roman" w:hAnsi="Times New Roman" w:cs="Times New Roman"/>
+          <w:sz w:val="18"/>
+          <w:szCs w:val="18"/>
+          <w:lang w:val="en-US"/>
+        </w:rPr>
         <w:t>Figura 1</w:t>
       </w:r>
       <w:r>
@@ -3655,7 +3977,7 @@
           <w:rFonts w:ascii="Times New Roman" w:hAnsi="Times New Roman" w:cs="Times New Roman"/>
           <w:sz w:val="18"/>
           <w:szCs w:val="18"/>
-          <w:highlight w:val="yellow"/>
+          <w:lang w:val="en-US"/>
         </w:rPr>
         <w:t>2</w:t>
       </w:r>
@@ -3664,90 +3986,224 @@
           <w:rFonts w:ascii="Times New Roman" w:hAnsi="Times New Roman" w:cs="Times New Roman"/>
           <w:sz w:val="18"/>
           <w:szCs w:val="18"/>
-          <w:highlight w:val="yellow"/>
-        </w:rPr>
-        <w:t>. Legenda.</w:t>
-      </w:r>
-    </w:p>
-    <w:p>
-      <w:pPr>
-        <w:rPr>
-          <w:rFonts w:ascii="Times New Roman" w:hAnsi="Times New Roman" w:cs="Times New Roman"/>
-          <w:b/>
-          <w:bCs/>
-          <w:sz w:val="24"/>
-          <w:szCs w:val="24"/>
-          <w:highlight w:val="yellow"/>
-        </w:rPr>
-      </w:pPr>
-      <w:r>
-        <w:rPr>
-          <w:rFonts w:ascii="Times New Roman" w:hAnsi="Times New Roman" w:cs="Times New Roman"/>
-          <w:b/>
-          <w:bCs/>
-          <w:sz w:val="24"/>
-          <w:szCs w:val="24"/>
-          <w:highlight w:val="yellow"/>
+          <w:lang w:val="en-US"/>
+        </w:rPr>
+        <w:t xml:space="preserve">. </w:t>
+      </w:r>
+      <w:r>
+        <w:rPr>
+          <w:rFonts w:ascii="Times New Roman" w:hAnsi="Times New Roman" w:cs="Times New Roman"/>
+          <w:sz w:val="18"/>
+          <w:szCs w:val="18"/>
+          <w:lang w:val="en-US"/>
+        </w:rPr>
+        <w:t>Output of</w:t>
+      </w:r>
+      <w:r>
+        <w:rPr>
+          <w:rFonts w:ascii="Times New Roman" w:hAnsi="Times New Roman" w:cs="Times New Roman"/>
+          <w:sz w:val="18"/>
+          <w:szCs w:val="18"/>
+          <w:lang w:val="en-US"/>
+        </w:rPr>
+        <w:t xml:space="preserve"> running my_split_bootstrap.py</w:t>
+      </w:r>
+    </w:p>
+    <w:p w14:noSpellErr="1">
+      <w:pPr>
+        <w:rPr>
+          <w:rFonts w:ascii="Times New Roman" w:hAnsi="Times New Roman" w:cs="Times New Roman"/>
+          <w:b w:val="1"/>
+          <w:bCs w:val="1"/>
+          <w:sz w:val="24"/>
+          <w:szCs w:val="24"/>
+        </w:rPr>
+      </w:pPr>
+      <w:r>
+        <w:rPr>
+          <w:rFonts w:ascii="Times New Roman" w:hAnsi="Times New Roman" w:cs="Times New Roman"/>
+          <w:b w:val="1"/>
+          <w:bCs w:val="1"/>
+          <w:sz w:val="24"/>
+          <w:szCs w:val="24"/>
         </w:rPr>
         <w:t>5</w:t>
       </w:r>
       <w:r>
         <w:rPr>
           <w:rFonts w:ascii="Times New Roman" w:hAnsi="Times New Roman" w:cs="Times New Roman"/>
-          <w:b/>
-          <w:bCs/>
-          <w:sz w:val="24"/>
-          <w:szCs w:val="24"/>
-          <w:highlight w:val="yellow"/>
+          <w:b w:val="1"/>
+          <w:bCs w:val="1"/>
+          <w:sz w:val="24"/>
+          <w:szCs w:val="24"/>
         </w:rPr>
         <w:t>. b)</w:t>
       </w:r>
     </w:p>
     <w:p>
       <w:pPr>
-        <w:rPr>
-          <w:rFonts w:ascii="Times New Roman" w:hAnsi="Times New Roman" w:cs="Times New Roman"/>
-          <w:highlight w:val="yellow"/>
-        </w:rPr>
-      </w:pPr>
-      <w:r>
-        <w:rPr>
-          <w:rFonts w:ascii="Times New Roman" w:hAnsi="Times New Roman" w:cs="Times New Roman"/>
-          <w:highlight w:val="yellow"/>
-        </w:rPr>
-        <w:t>INTRODUÇÃO</w:t>
-      </w:r>
-    </w:p>
-    <w:p>
-      <w:pPr>
-        <w:rPr>
-          <w:rFonts w:ascii="Times New Roman" w:hAnsi="Times New Roman" w:cs="Times New Roman"/>
-          <w:highlight w:val="yellow"/>
-        </w:rPr>
-      </w:pPr>
-      <w:r>
-        <w:rPr>
-          <w:rFonts w:ascii="Times New Roman" w:hAnsi="Times New Roman" w:cs="Times New Roman"/>
-          <w:highlight w:val="yellow"/>
-        </w:rPr>
-        <w:t>X</w:t>
-      </w:r>
-    </w:p>
-    <w:p>
-      <w:pPr>
-        <w:rPr>
-          <w:rFonts w:ascii="Times New Roman" w:hAnsi="Times New Roman" w:cs="Times New Roman"/>
-          <w:sz w:val="18"/>
-          <w:szCs w:val="18"/>
-          <w:highlight w:val="yellow"/>
-        </w:rPr>
-      </w:pPr>
-      <w:r>
-        <w:rPr>
-          <w:rFonts w:ascii="Times New Roman" w:hAnsi="Times New Roman" w:cs="Times New Roman"/>
-          <w:sz w:val="18"/>
-          <w:szCs w:val="18"/>
-          <w:highlight w:val="yellow"/>
+        <w:pStyle w:val="Normal"/>
+        <w:rPr>
+          <w:rFonts w:ascii="Times New Roman" w:hAnsi="Times New Roman" w:eastAsia="Times New Roman" w:cs="Times New Roman"/>
+          <w:b w:val="0"/>
+          <w:bCs w:val="0"/>
+          <w:i w:val="0"/>
+          <w:iCs w:val="0"/>
+          <w:caps w:val="0"/>
+          <w:smallCaps w:val="0"/>
+          <w:noProof w:val="0"/>
+          <w:color w:val="auto"/>
+          <w:sz w:val="22"/>
+          <w:szCs w:val="22"/>
+          <w:lang w:val="en-US"/>
+        </w:rPr>
+      </w:pPr>
+      <w:r>
+        <w:rPr>
+          <w:rFonts w:ascii="Times New Roman" w:hAnsi="Times New Roman" w:eastAsia="Times New Roman" w:cs="Times New Roman"/>
+          <w:b w:val="0"/>
+          <w:bCs w:val="0"/>
+          <w:i w:val="0"/>
+          <w:iCs w:val="0"/>
+          <w:caps w:val="0"/>
+          <w:smallCaps w:val="0"/>
+          <w:noProof w:val="0"/>
+          <w:color w:val="auto"/>
+          <w:sz w:val="22"/>
+          <w:szCs w:val="22"/>
+          <w:lang w:val="en-US"/>
+        </w:rPr>
+        <w:t xml:space="preserve">The test set must </w:t>
+      </w:r>
+      <w:r>
+        <w:rPr>
+          <w:rFonts w:ascii="Times New Roman" w:hAnsi="Times New Roman" w:eastAsia="Times New Roman" w:cs="Times New Roman"/>
+          <w:b w:val="0"/>
+          <w:bCs w:val="0"/>
+          <w:i w:val="0"/>
+          <w:iCs w:val="0"/>
+          <w:caps w:val="0"/>
+          <w:smallCaps w:val="0"/>
+          <w:noProof w:val="0"/>
+          <w:color w:val="auto"/>
+          <w:sz w:val="22"/>
+          <w:szCs w:val="22"/>
+          <w:lang w:val="en-US"/>
+        </w:rPr>
+        <w:t>contain</w:t>
+      </w:r>
+      <w:r>
+        <w:rPr>
+          <w:rFonts w:ascii="Times New Roman" w:hAnsi="Times New Roman" w:eastAsia="Times New Roman" w:cs="Times New Roman"/>
+          <w:b w:val="0"/>
+          <w:bCs w:val="0"/>
+          <w:i w:val="0"/>
+          <w:iCs w:val="0"/>
+          <w:caps w:val="0"/>
+          <w:smallCaps w:val="0"/>
+          <w:noProof w:val="0"/>
+          <w:color w:val="auto"/>
+          <w:sz w:val="22"/>
+          <w:szCs w:val="22"/>
+          <w:lang w:val="en-US"/>
+        </w:rPr>
+        <w:t xml:space="preserve"> only samples not used in training. We </w:t>
+      </w:r>
+      <w:r>
+        <w:rPr>
+          <w:rFonts w:ascii="Times New Roman" w:hAnsi="Times New Roman" w:eastAsia="Times New Roman" w:cs="Times New Roman"/>
+          <w:b w:val="0"/>
+          <w:bCs w:val="0"/>
+          <w:i w:val="0"/>
+          <w:iCs w:val="0"/>
+          <w:caps w:val="0"/>
+          <w:smallCaps w:val="0"/>
+          <w:noProof w:val="0"/>
+          <w:color w:val="auto"/>
+          <w:sz w:val="22"/>
+          <w:szCs w:val="22"/>
+          <w:lang w:val="en-US"/>
+        </w:rPr>
+        <w:t>filter</w:t>
+      </w:r>
+      <w:r>
+        <w:rPr>
+          <w:rFonts w:ascii="Times New Roman" w:hAnsi="Times New Roman" w:eastAsia="Times New Roman" w:cs="Times New Roman"/>
+          <w:b w:val="0"/>
+          <w:bCs w:val="0"/>
+          <w:i w:val="0"/>
+          <w:iCs w:val="0"/>
+          <w:caps w:val="0"/>
+          <w:smallCaps w:val="0"/>
+          <w:noProof w:val="0"/>
+          <w:color w:val="auto"/>
+          <w:sz w:val="22"/>
+          <w:szCs w:val="22"/>
+          <w:lang w:val="en-US"/>
+        </w:rPr>
+        <w:t xml:space="preserve"> the original indices to keep only those absent from the training set, enabling proper model evaluation.</w:t>
+      </w:r>
+    </w:p>
+    <w:p>
+      <w:pPr>
+        <w:pStyle w:val="Normal"/>
+        <w:jc w:val="center"/>
+        <w:rPr>
+          <w:rFonts w:ascii="Times New Roman" w:hAnsi="Times New Roman" w:cs="Times New Roman"/>
+          <w:sz w:val="18"/>
+          <w:szCs w:val="18"/>
+          <w:lang w:val="en-US"/>
+        </w:rPr>
+      </w:pPr>
+      <w:r>
+        <w:drawing>
+          <wp:inline wp14:editId="0C6D89E9" wp14:anchorId="141F1DFD">
+            <wp:extent cx="5400675" cy="1514475"/>
+            <wp:effectExtent l="0" t="0" r="0" b="0"/>
+            <wp:docPr id="697990914" name="drawing"/>
+            <wp:cNvGraphicFramePr>
+              <a:graphicFrameLocks noChangeAspect="1"/>
+            </wp:cNvGraphicFramePr>
+            <a:graphic>
+              <a:graphicData xmlns:a="http://schemas.openxmlformats.org/drawingml/2006/main" uri="http://schemas.openxmlformats.org/drawingml/2006/picture">
+                <pic:pic xmlns:pic="http://schemas.openxmlformats.org/drawingml/2006/picture">
+                  <pic:nvPicPr>
+                    <pic:cNvPr id="697990914" name="Picture 697990914"/>
+                    <pic:cNvPicPr/>
+                  </pic:nvPicPr>
+                  <pic:blipFill>
+                    <a:blip xmlns:r="http://schemas.openxmlformats.org/officeDocument/2006/relationships" r:embed="rId1079264968">
+                      <a:extLst>
+                        <a:ext uri="{28A0092B-C50C-407E-A947-70E740481C1C}">
+                          <a14:useLocalDpi xmlns:a14="http://schemas.microsoft.com/office/drawing/2010/main"/>
+                        </a:ext>
+                      </a:extLst>
+                    </a:blip>
+                    <a:stretch>
+                      <a:fillRect/>
+                    </a:stretch>
+                  </pic:blipFill>
+                  <pic:spPr>
+                    <a:xfrm>
+                      <a:off x="0" y="0"/>
+                      <a:ext cx="5400675" cy="1514475"/>
+                    </a:xfrm>
+                    <a:prstGeom prst="rect">
+                      <a:avLst/>
+                    </a:prstGeom>
+                  </pic:spPr>
+                </pic:pic>
+              </a:graphicData>
+            </a:graphic>
+          </wp:inline>
+        </w:drawing>
+      </w:r>
+      <w:r>
+        <w:rPr>
+          <w:rFonts w:ascii="Times New Roman" w:hAnsi="Times New Roman" w:cs="Times New Roman"/>
+          <w:sz w:val="18"/>
+          <w:szCs w:val="18"/>
+          <w:lang w:val="en-US"/>
         </w:rPr>
         <w:t>Figura 1</w:t>
       </w:r>
@@ -3756,7 +4212,7 @@
           <w:rFonts w:ascii="Times New Roman" w:hAnsi="Times New Roman" w:cs="Times New Roman"/>
           <w:sz w:val="18"/>
           <w:szCs w:val="18"/>
-          <w:highlight w:val="yellow"/>
+          <w:lang w:val="en-US"/>
         </w:rPr>
         <w:t>3</w:t>
       </w:r>
@@ -3765,90 +4221,188 @@
           <w:rFonts w:ascii="Times New Roman" w:hAnsi="Times New Roman" w:cs="Times New Roman"/>
           <w:sz w:val="18"/>
           <w:szCs w:val="18"/>
-          <w:highlight w:val="yellow"/>
-        </w:rPr>
-        <w:t>. Legenda.</w:t>
-      </w:r>
-    </w:p>
-    <w:p>
-      <w:pPr>
-        <w:rPr>
-          <w:rFonts w:ascii="Times New Roman" w:hAnsi="Times New Roman" w:cs="Times New Roman"/>
-          <w:b/>
-          <w:bCs/>
-          <w:sz w:val="24"/>
-          <w:szCs w:val="24"/>
-          <w:highlight w:val="yellow"/>
-        </w:rPr>
-      </w:pPr>
-      <w:r>
-        <w:rPr>
-          <w:rFonts w:ascii="Times New Roman" w:hAnsi="Times New Roman" w:cs="Times New Roman"/>
-          <w:b/>
-          <w:bCs/>
-          <w:sz w:val="24"/>
-          <w:szCs w:val="24"/>
-          <w:highlight w:val="yellow"/>
+          <w:lang w:val="en-US"/>
+        </w:rPr>
+        <w:t xml:space="preserve">. </w:t>
+      </w:r>
+      <w:r>
+        <w:rPr>
+          <w:rFonts w:ascii="Times New Roman" w:hAnsi="Times New Roman" w:cs="Times New Roman"/>
+          <w:sz w:val="18"/>
+          <w:szCs w:val="18"/>
+          <w:lang w:val="en-US"/>
+        </w:rPr>
+        <w:t>Output after updating split method</w:t>
+      </w:r>
+      <w:r>
+        <w:rPr>
+          <w:rFonts w:ascii="Times New Roman" w:hAnsi="Times New Roman" w:cs="Times New Roman"/>
+          <w:sz w:val="18"/>
+          <w:szCs w:val="18"/>
+          <w:lang w:val="en-US"/>
+        </w:rPr>
+        <w:t>.</w:t>
+      </w:r>
+    </w:p>
+    <w:p w14:noSpellErr="1">
+      <w:pPr>
+        <w:rPr>
+          <w:rFonts w:ascii="Times New Roman" w:hAnsi="Times New Roman" w:cs="Times New Roman"/>
+          <w:b w:val="1"/>
+          <w:bCs w:val="1"/>
+          <w:sz w:val="24"/>
+          <w:szCs w:val="24"/>
+        </w:rPr>
+      </w:pPr>
+      <w:r>
+        <w:rPr>
+          <w:rFonts w:ascii="Times New Roman" w:hAnsi="Times New Roman" w:cs="Times New Roman"/>
+          <w:b w:val="1"/>
+          <w:bCs w:val="1"/>
+          <w:sz w:val="24"/>
+          <w:szCs w:val="24"/>
         </w:rPr>
         <w:t>5</w:t>
       </w:r>
       <w:r>
         <w:rPr>
           <w:rFonts w:ascii="Times New Roman" w:hAnsi="Times New Roman" w:cs="Times New Roman"/>
-          <w:b/>
-          <w:bCs/>
-          <w:sz w:val="24"/>
-          <w:szCs w:val="24"/>
-          <w:highlight w:val="yellow"/>
+          <w:b w:val="1"/>
+          <w:bCs w:val="1"/>
+          <w:sz w:val="24"/>
+          <w:szCs w:val="24"/>
         </w:rPr>
         <w:t>. c)</w:t>
       </w:r>
     </w:p>
     <w:p>
       <w:pPr>
-        <w:rPr>
-          <w:rFonts w:ascii="Times New Roman" w:hAnsi="Times New Roman" w:cs="Times New Roman"/>
-          <w:highlight w:val="yellow"/>
-        </w:rPr>
-      </w:pPr>
-      <w:r>
-        <w:rPr>
-          <w:rFonts w:ascii="Times New Roman" w:hAnsi="Times New Roman" w:cs="Times New Roman"/>
-          <w:highlight w:val="yellow"/>
-        </w:rPr>
-        <w:t>INTRODUÇÃO</w:t>
-      </w:r>
-    </w:p>
-    <w:p>
-      <w:pPr>
-        <w:rPr>
-          <w:rFonts w:ascii="Times New Roman" w:hAnsi="Times New Roman" w:cs="Times New Roman"/>
-          <w:highlight w:val="yellow"/>
-        </w:rPr>
-      </w:pPr>
-      <w:r>
-        <w:rPr>
-          <w:rFonts w:ascii="Times New Roman" w:hAnsi="Times New Roman" w:cs="Times New Roman"/>
-          <w:highlight w:val="yellow"/>
-        </w:rPr>
-        <w:t>X</w:t>
-      </w:r>
-    </w:p>
-    <w:p>
-      <w:pPr>
-        <w:rPr>
-          <w:rFonts w:ascii="Times New Roman" w:hAnsi="Times New Roman" w:cs="Times New Roman"/>
-          <w:sz w:val="18"/>
-          <w:szCs w:val="18"/>
-          <w:highlight w:val="yellow"/>
-        </w:rPr>
-      </w:pPr>
-      <w:r>
-        <w:rPr>
-          <w:rFonts w:ascii="Times New Roman" w:hAnsi="Times New Roman" w:cs="Times New Roman"/>
-          <w:sz w:val="18"/>
-          <w:szCs w:val="18"/>
-          <w:highlight w:val="yellow"/>
+        <w:pStyle w:val="Normal"/>
+        <w:rPr>
+          <w:rFonts w:ascii="Times New Roman" w:hAnsi="Times New Roman" w:eastAsia="Times New Roman" w:cs="Times New Roman"/>
+          <w:b w:val="0"/>
+          <w:bCs w:val="0"/>
+          <w:i w:val="0"/>
+          <w:iCs w:val="0"/>
+          <w:caps w:val="0"/>
+          <w:smallCaps w:val="0"/>
+          <w:noProof w:val="0"/>
+          <w:color w:val="auto"/>
+          <w:sz w:val="22"/>
+          <w:szCs w:val="22"/>
+          <w:lang w:val="en-US"/>
+        </w:rPr>
+      </w:pPr>
+      <w:r>
+        <w:rPr>
+          <w:rFonts w:ascii="Times New Roman" w:hAnsi="Times New Roman" w:eastAsia="Times New Roman" w:cs="Times New Roman"/>
+          <w:b w:val="0"/>
+          <w:bCs w:val="0"/>
+          <w:i w:val="0"/>
+          <w:iCs w:val="0"/>
+          <w:caps w:val="0"/>
+          <w:smallCaps w:val="0"/>
+          <w:noProof w:val="0"/>
+          <w:color w:val="auto"/>
+          <w:sz w:val="22"/>
+          <w:szCs w:val="22"/>
+          <w:lang w:val="en-US"/>
+        </w:rPr>
+        <w:t xml:space="preserve">We tested bootstrap resampling with 10, 50, and 100 repetitions to </w:t>
+      </w:r>
+      <w:r>
+        <w:rPr>
+          <w:rFonts w:ascii="Times New Roman" w:hAnsi="Times New Roman" w:eastAsia="Times New Roman" w:cs="Times New Roman"/>
+          <w:b w:val="0"/>
+          <w:bCs w:val="0"/>
+          <w:i w:val="0"/>
+          <w:iCs w:val="0"/>
+          <w:caps w:val="0"/>
+          <w:smallCaps w:val="0"/>
+          <w:noProof w:val="0"/>
+          <w:color w:val="auto"/>
+          <w:sz w:val="22"/>
+          <w:szCs w:val="22"/>
+          <w:lang w:val="en-US"/>
+        </w:rPr>
+        <w:t>demonstrate</w:t>
+      </w:r>
+      <w:r>
+        <w:rPr>
+          <w:rFonts w:ascii="Times New Roman" w:hAnsi="Times New Roman" w:eastAsia="Times New Roman" w:cs="Times New Roman"/>
+          <w:b w:val="0"/>
+          <w:bCs w:val="0"/>
+          <w:i w:val="0"/>
+          <w:iCs w:val="0"/>
+          <w:caps w:val="0"/>
+          <w:smallCaps w:val="0"/>
+          <w:noProof w:val="0"/>
+          <w:color w:val="auto"/>
+          <w:sz w:val="22"/>
+          <w:szCs w:val="22"/>
+          <w:lang w:val="en-US"/>
+        </w:rPr>
+        <w:t xml:space="preserve"> how increasing the number of train-test splits provides more robust model evaluation through multiple independent validation rounds.</w:t>
+      </w:r>
+    </w:p>
+    <w:p>
+      <w:pPr>
+        <w:pStyle w:val="Normal"/>
+        <w:jc w:val="center"/>
+        <w:rPr>
+          <w:rFonts w:ascii="Times New Roman" w:hAnsi="Times New Roman" w:cs="Times New Roman"/>
+          <w:sz w:val="18"/>
+          <w:szCs w:val="18"/>
+        </w:rPr>
+      </w:pPr>
+      <w:r>
+        <w:drawing>
+          <wp:inline wp14:editId="4EDF0034" wp14:anchorId="415A6841">
+            <wp:extent cx="5400675" cy="2057400"/>
+            <wp:effectExtent l="0" t="0" r="0" b="0"/>
+            <wp:docPr id="1076856516" name="drawing"/>
+            <wp:cNvGraphicFramePr>
+              <a:graphicFrameLocks noChangeAspect="1"/>
+            </wp:cNvGraphicFramePr>
+            <a:graphic>
+              <a:graphicData xmlns:a="http://schemas.openxmlformats.org/drawingml/2006/main" uri="http://schemas.openxmlformats.org/drawingml/2006/picture">
+                <pic:pic xmlns:pic="http://schemas.openxmlformats.org/drawingml/2006/picture">
+                  <pic:nvPicPr>
+                    <pic:cNvPr id="1076856516" name="Picture 1076856516"/>
+                    <pic:cNvPicPr/>
+                  </pic:nvPicPr>
+                  <pic:blipFill>
+                    <a:blip xmlns:r="http://schemas.openxmlformats.org/officeDocument/2006/relationships" r:embed="rId279308421">
+                      <a:extLst>
+                        <a:ext uri="{28A0092B-C50C-407E-A947-70E740481C1C}">
+                          <a14:useLocalDpi xmlns:a14="http://schemas.microsoft.com/office/drawing/2010/main"/>
+                        </a:ext>
+                      </a:extLst>
+                    </a:blip>
+                    <a:stretch>
+                      <a:fillRect/>
+                    </a:stretch>
+                  </pic:blipFill>
+                  <pic:spPr>
+                    <a:xfrm>
+                      <a:off x="0" y="0"/>
+                      <a:ext cx="5400675" cy="2057400"/>
+                    </a:xfrm>
+                    <a:prstGeom prst="rect">
+                      <a:avLst/>
+                    </a:prstGeom>
+                  </pic:spPr>
+                </pic:pic>
+              </a:graphicData>
+            </a:graphic>
+          </wp:inline>
+        </w:drawing>
+      </w:r>
+      <w:r>
+        <w:rPr>
+          <w:rFonts w:ascii="Times New Roman" w:hAnsi="Times New Roman" w:cs="Times New Roman"/>
+          <w:sz w:val="18"/>
+          <w:szCs w:val="18"/>
         </w:rPr>
         <w:t>Figura 1</w:t>
       </w:r>
@@ -3857,7 +4411,6 @@
           <w:rFonts w:ascii="Times New Roman" w:hAnsi="Times New Roman" w:cs="Times New Roman"/>
           <w:sz w:val="18"/>
           <w:szCs w:val="18"/>
-          <w:highlight w:val="yellow"/>
         </w:rPr>
         <w:t>4</w:t>
       </w:r>
@@ -3866,233 +4419,278 @@
           <w:rFonts w:ascii="Times New Roman" w:hAnsi="Times New Roman" w:cs="Times New Roman"/>
           <w:sz w:val="18"/>
           <w:szCs w:val="18"/>
-          <w:highlight w:val="yellow"/>
-        </w:rPr>
-        <w:t>. Legenda.</w:t>
-      </w:r>
-    </w:p>
-    <w:p>
-      <w:pPr>
-        <w:rPr>
-          <w:rFonts w:ascii="Times New Roman" w:hAnsi="Times New Roman" w:cs="Times New Roman"/>
-          <w:b/>
-          <w:bCs/>
-          <w:sz w:val="24"/>
-          <w:szCs w:val="24"/>
-          <w:highlight w:val="yellow"/>
-        </w:rPr>
-      </w:pPr>
-      <w:r>
-        <w:rPr>
-          <w:rFonts w:ascii="Times New Roman" w:hAnsi="Times New Roman" w:cs="Times New Roman"/>
-          <w:b/>
-          <w:bCs/>
-          <w:sz w:val="24"/>
-          <w:szCs w:val="24"/>
-          <w:highlight w:val="yellow"/>
-        </w:rPr>
-        <w:t xml:space="preserve">5. </w:t>
-      </w:r>
-      <w:r>
-        <w:rPr>
-          <w:rFonts w:ascii="Times New Roman" w:hAnsi="Times New Roman" w:cs="Times New Roman"/>
-          <w:b/>
-          <w:bCs/>
-          <w:sz w:val="24"/>
-          <w:szCs w:val="24"/>
-          <w:highlight w:val="yellow"/>
-        </w:rPr>
-        <w:t>d</w:t>
-      </w:r>
-      <w:r>
-        <w:rPr>
-          <w:rFonts w:ascii="Times New Roman" w:hAnsi="Times New Roman" w:cs="Times New Roman"/>
-          <w:b/>
-          <w:bCs/>
-          <w:sz w:val="24"/>
-          <w:szCs w:val="24"/>
-          <w:highlight w:val="yellow"/>
-        </w:rPr>
-        <w:t>)</w:t>
-      </w:r>
-    </w:p>
-    <w:p>
-      <w:pPr>
-        <w:rPr>
-          <w:rFonts w:ascii="Times New Roman" w:hAnsi="Times New Roman" w:cs="Times New Roman"/>
-          <w:highlight w:val="yellow"/>
-        </w:rPr>
-      </w:pPr>
-      <w:r>
-        <w:rPr>
-          <w:rFonts w:ascii="Times New Roman" w:hAnsi="Times New Roman" w:cs="Times New Roman"/>
-          <w:highlight w:val="yellow"/>
-        </w:rPr>
-        <w:t>INTRODUÇÃO</w:t>
-      </w:r>
-    </w:p>
-    <w:p>
-      <w:pPr>
-        <w:rPr>
-          <w:rFonts w:ascii="Times New Roman" w:hAnsi="Times New Roman" w:cs="Times New Roman"/>
-          <w:highlight w:val="yellow"/>
-        </w:rPr>
-      </w:pPr>
-      <w:r>
-        <w:rPr>
-          <w:rFonts w:ascii="Times New Roman" w:hAnsi="Times New Roman" w:cs="Times New Roman"/>
-          <w:highlight w:val="yellow"/>
-        </w:rPr>
-        <w:t>X</w:t>
-      </w:r>
-    </w:p>
-    <w:p>
-      <w:pPr>
-        <w:rPr>
-          <w:rFonts w:ascii="Times New Roman" w:hAnsi="Times New Roman" w:cs="Times New Roman"/>
-          <w:sz w:val="18"/>
-          <w:szCs w:val="18"/>
-          <w:highlight w:val="yellow"/>
-        </w:rPr>
-      </w:pPr>
-      <w:r>
-        <w:rPr>
-          <w:rFonts w:ascii="Times New Roman" w:hAnsi="Times New Roman" w:cs="Times New Roman"/>
-          <w:sz w:val="18"/>
-          <w:szCs w:val="18"/>
-          <w:highlight w:val="yellow"/>
-        </w:rPr>
-        <w:t>Figura 1</w:t>
-      </w:r>
-      <w:r>
-        <w:rPr>
-          <w:rFonts w:ascii="Times New Roman" w:hAnsi="Times New Roman" w:cs="Times New Roman"/>
-          <w:sz w:val="18"/>
-          <w:szCs w:val="18"/>
-          <w:highlight w:val="yellow"/>
-        </w:rPr>
-        <w:t>5</w:t>
-      </w:r>
-      <w:r>
-        <w:rPr>
-          <w:rFonts w:ascii="Times New Roman" w:hAnsi="Times New Roman" w:cs="Times New Roman"/>
-          <w:sz w:val="18"/>
-          <w:szCs w:val="18"/>
-          <w:highlight w:val="yellow"/>
-        </w:rPr>
-        <w:t>. Legenda.</w:t>
-      </w:r>
-    </w:p>
-    <w:p>
-      <w:pPr>
-        <w:rPr>
-          <w:rFonts w:ascii="Times New Roman" w:hAnsi="Times New Roman" w:cs="Times New Roman"/>
-          <w:b/>
-          <w:bCs/>
-          <w:sz w:val="24"/>
-          <w:szCs w:val="24"/>
-          <w:highlight w:val="yellow"/>
-        </w:rPr>
-      </w:pPr>
-      <w:r>
-        <w:rPr>
-          <w:rFonts w:ascii="Times New Roman" w:hAnsi="Times New Roman" w:cs="Times New Roman"/>
-          <w:b/>
-          <w:bCs/>
-          <w:sz w:val="24"/>
-          <w:szCs w:val="24"/>
-          <w:highlight w:val="yellow"/>
-        </w:rPr>
-        <w:t xml:space="preserve">5. </w:t>
-      </w:r>
-      <w:r>
-        <w:rPr>
-          <w:rFonts w:ascii="Times New Roman" w:hAnsi="Times New Roman" w:cs="Times New Roman"/>
-          <w:b/>
-          <w:bCs/>
-          <w:sz w:val="24"/>
-          <w:szCs w:val="24"/>
-          <w:highlight w:val="yellow"/>
-        </w:rPr>
-        <w:t>e</w:t>
-      </w:r>
-      <w:r>
-        <w:rPr>
-          <w:rFonts w:ascii="Times New Roman" w:hAnsi="Times New Roman" w:cs="Times New Roman"/>
-          <w:b/>
-          <w:bCs/>
-          <w:sz w:val="24"/>
-          <w:szCs w:val="24"/>
-          <w:highlight w:val="yellow"/>
-        </w:rPr>
-        <w:t>)</w:t>
-      </w:r>
-    </w:p>
-    <w:p>
-      <w:pPr>
-        <w:rPr>
-          <w:rFonts w:ascii="Times New Roman" w:hAnsi="Times New Roman" w:cs="Times New Roman"/>
-          <w:highlight w:val="yellow"/>
-        </w:rPr>
-      </w:pPr>
-      <w:r>
-        <w:rPr>
-          <w:rFonts w:ascii="Times New Roman" w:hAnsi="Times New Roman" w:cs="Times New Roman"/>
-          <w:highlight w:val="yellow"/>
-        </w:rPr>
-        <w:t>INTRODUÇÃO</w:t>
-      </w:r>
-    </w:p>
-    <w:p>
-      <w:pPr>
-        <w:rPr>
-          <w:rFonts w:ascii="Times New Roman" w:hAnsi="Times New Roman" w:cs="Times New Roman"/>
-          <w:highlight w:val="yellow"/>
-        </w:rPr>
-      </w:pPr>
-      <w:r>
-        <w:rPr>
-          <w:rFonts w:ascii="Times New Roman" w:hAnsi="Times New Roman" w:cs="Times New Roman"/>
-          <w:highlight w:val="yellow"/>
-        </w:rPr>
-        <w:t>X</w:t>
-      </w:r>
-    </w:p>
-    <w:p>
-      <w:pPr>
-        <w:rPr>
-          <w:rFonts w:ascii="Times New Roman" w:hAnsi="Times New Roman" w:cs="Times New Roman"/>
-          <w:sz w:val="18"/>
-          <w:szCs w:val="18"/>
-          <w:highlight w:val="yellow"/>
-        </w:rPr>
-      </w:pPr>
-      <w:r>
-        <w:rPr>
-          <w:rFonts w:ascii="Times New Roman" w:hAnsi="Times New Roman" w:cs="Times New Roman"/>
-          <w:sz w:val="18"/>
-          <w:szCs w:val="18"/>
-          <w:highlight w:val="yellow"/>
-        </w:rPr>
-        <w:t>Figura 1</w:t>
-      </w:r>
-      <w:r>
-        <w:rPr>
-          <w:rFonts w:ascii="Times New Roman" w:hAnsi="Times New Roman" w:cs="Times New Roman"/>
-          <w:sz w:val="18"/>
-          <w:szCs w:val="18"/>
-          <w:highlight w:val="yellow"/>
-        </w:rPr>
-        <w:t>6</w:t>
-      </w:r>
-      <w:r>
-        <w:rPr>
-          <w:rFonts w:ascii="Times New Roman" w:hAnsi="Times New Roman" w:cs="Times New Roman"/>
-          <w:sz w:val="18"/>
-          <w:szCs w:val="18"/>
-          <w:highlight w:val="yellow"/>
-        </w:rPr>
-        <w:t>. Legenda.</w:t>
+        </w:rPr>
+        <w:t xml:space="preserve">. </w:t>
+      </w:r>
+      <w:r>
+        <w:rPr>
+          <w:rFonts w:ascii="Times New Roman" w:hAnsi="Times New Roman" w:cs="Times New Roman"/>
+          <w:sz w:val="18"/>
+          <w:szCs w:val="18"/>
+        </w:rPr>
+        <w:t xml:space="preserve">Output </w:t>
+      </w:r>
+      <w:r>
+        <w:rPr>
+          <w:rFonts w:ascii="Times New Roman" w:hAnsi="Times New Roman" w:cs="Times New Roman"/>
+          <w:sz w:val="18"/>
+          <w:szCs w:val="18"/>
+        </w:rPr>
+        <w:t>with</w:t>
+      </w:r>
+      <w:r>
+        <w:rPr>
+          <w:rFonts w:ascii="Times New Roman" w:hAnsi="Times New Roman" w:cs="Times New Roman"/>
+          <w:sz w:val="18"/>
+          <w:szCs w:val="18"/>
+        </w:rPr>
+        <w:t xml:space="preserve"> </w:t>
+      </w:r>
+      <w:r>
+        <w:rPr>
+          <w:rFonts w:ascii="Times New Roman" w:hAnsi="Times New Roman" w:cs="Times New Roman"/>
+          <w:sz w:val="18"/>
+          <w:szCs w:val="18"/>
+        </w:rPr>
+        <w:t>different</w:t>
+      </w:r>
+      <w:r>
+        <w:rPr>
+          <w:rFonts w:ascii="Times New Roman" w:hAnsi="Times New Roman" w:cs="Times New Roman"/>
+          <w:sz w:val="18"/>
+          <w:szCs w:val="18"/>
+        </w:rPr>
+        <w:t xml:space="preserve"> repetitions</w:t>
+      </w:r>
+      <w:r>
+        <w:rPr>
+          <w:rFonts w:ascii="Times New Roman" w:hAnsi="Times New Roman" w:cs="Times New Roman"/>
+          <w:sz w:val="18"/>
+          <w:szCs w:val="18"/>
+        </w:rPr>
+        <w:t>.</w:t>
+      </w:r>
+    </w:p>
+    <w:p>
+      <w:pPr>
+        <w:rPr>
+          <w:rFonts w:ascii="Times New Roman" w:hAnsi="Times New Roman" w:cs="Times New Roman"/>
+          <w:b w:val="1"/>
+          <w:bCs w:val="1"/>
+          <w:sz w:val="24"/>
+          <w:szCs w:val="24"/>
+        </w:rPr>
+      </w:pPr>
+    </w:p>
+    <w:p>
+      <w:pPr>
+        <w:rPr>
+          <w:rFonts w:ascii="Times New Roman" w:hAnsi="Times New Roman" w:cs="Times New Roman"/>
+          <w:b w:val="1"/>
+          <w:bCs w:val="1"/>
+          <w:sz w:val="24"/>
+          <w:szCs w:val="24"/>
+        </w:rPr>
+      </w:pPr>
+      <w:r>
+        <w:rPr>
+          <w:rFonts w:ascii="Times New Roman" w:hAnsi="Times New Roman" w:cs="Times New Roman"/>
+          <w:b w:val="1"/>
+          <w:bCs w:val="1"/>
+          <w:sz w:val="24"/>
+          <w:szCs w:val="24"/>
+        </w:rPr>
+        <w:t>5. e)</w:t>
+      </w:r>
+    </w:p>
+    <w:p>
+      <w:pPr>
+        <w:pStyle w:val="Normal"/>
+        <w:jc w:val="both"/>
+        <w:rPr>
+          <w:rFonts w:ascii="Times New Roman" w:hAnsi="Times New Roman" w:eastAsia="Times New Roman" w:cs="Times New Roman"/>
+          <w:b w:val="0"/>
+          <w:bCs w:val="0"/>
+          <w:i w:val="0"/>
+          <w:iCs w:val="0"/>
+          <w:caps w:val="0"/>
+          <w:smallCaps w:val="0"/>
+          <w:noProof w:val="0"/>
+          <w:color w:val="auto"/>
+          <w:sz w:val="22"/>
+          <w:szCs w:val="22"/>
+          <w:lang w:val="en-US"/>
+        </w:rPr>
+      </w:pPr>
+      <w:r>
+        <w:rPr>
+          <w:rFonts w:ascii="Times New Roman" w:hAnsi="Times New Roman" w:eastAsia="Times New Roman" w:cs="Times New Roman"/>
+          <w:b w:val="0"/>
+          <w:bCs w:val="0"/>
+          <w:i w:val="0"/>
+          <w:iCs w:val="0"/>
+          <w:caps w:val="0"/>
+          <w:smallCaps w:val="0"/>
+          <w:noProof w:val="0"/>
+          <w:color w:val="auto"/>
+          <w:sz w:val="22"/>
+          <w:szCs w:val="22"/>
+          <w:lang w:val="en-US"/>
+        </w:rPr>
+        <w:t xml:space="preserve">We implemented bootstrap train-test split methods by creating instances of </w:t>
+      </w:r>
+      <w:r>
+        <w:rPr>
+          <w:rFonts w:ascii="Times New Roman" w:hAnsi="Times New Roman" w:eastAsia="Times New Roman" w:cs="Times New Roman"/>
+          <w:b w:val="0"/>
+          <w:bCs w:val="0"/>
+          <w:i w:val="0"/>
+          <w:iCs w:val="0"/>
+          <w:caps w:val="0"/>
+          <w:smallCaps w:val="0"/>
+          <w:noProof w:val="0"/>
+          <w:color w:val="auto"/>
+          <w:sz w:val="22"/>
+          <w:szCs w:val="22"/>
+          <w:lang w:val="en-US"/>
+        </w:rPr>
+        <w:t>MyBootstrapSplitOnce</w:t>
+      </w:r>
+      <w:r>
+        <w:rPr>
+          <w:rFonts w:ascii="Times New Roman" w:hAnsi="Times New Roman" w:eastAsia="Times New Roman" w:cs="Times New Roman"/>
+          <w:b w:val="0"/>
+          <w:bCs w:val="0"/>
+          <w:i w:val="0"/>
+          <w:iCs w:val="0"/>
+          <w:caps w:val="0"/>
+          <w:smallCaps w:val="0"/>
+          <w:noProof w:val="0"/>
+          <w:color w:val="auto"/>
+          <w:sz w:val="22"/>
+          <w:szCs w:val="22"/>
+          <w:lang w:val="en-US"/>
+        </w:rPr>
+        <w:t xml:space="preserve"> and </w:t>
+      </w:r>
+      <w:r>
+        <w:rPr>
+          <w:rFonts w:ascii="Times New Roman" w:hAnsi="Times New Roman" w:eastAsia="Times New Roman" w:cs="Times New Roman"/>
+          <w:b w:val="0"/>
+          <w:bCs w:val="0"/>
+          <w:i w:val="0"/>
+          <w:iCs w:val="0"/>
+          <w:caps w:val="0"/>
+          <w:smallCaps w:val="0"/>
+          <w:noProof w:val="0"/>
+          <w:color w:val="auto"/>
+          <w:sz w:val="22"/>
+          <w:szCs w:val="22"/>
+          <w:lang w:val="en-US"/>
+        </w:rPr>
+        <w:t>MyBootstrapSplitRepeated</w:t>
+      </w:r>
+      <w:r>
+        <w:rPr>
+          <w:rFonts w:ascii="Times New Roman" w:hAnsi="Times New Roman" w:eastAsia="Times New Roman" w:cs="Times New Roman"/>
+          <w:b w:val="0"/>
+          <w:bCs w:val="0"/>
+          <w:i w:val="0"/>
+          <w:iCs w:val="0"/>
+          <w:caps w:val="0"/>
+          <w:smallCaps w:val="0"/>
+          <w:noProof w:val="0"/>
+          <w:color w:val="auto"/>
+          <w:sz w:val="22"/>
+          <w:szCs w:val="22"/>
+          <w:lang w:val="en-US"/>
+        </w:rPr>
+        <w:t xml:space="preserve"> classes </w:t>
+      </w:r>
+      <w:r>
+        <w:rPr>
+          <w:rFonts w:ascii="Times New Roman" w:hAnsi="Times New Roman" w:eastAsia="Times New Roman" w:cs="Times New Roman"/>
+          <w:b w:val="0"/>
+          <w:bCs w:val="0"/>
+          <w:i w:val="0"/>
+          <w:iCs w:val="0"/>
+          <w:caps w:val="0"/>
+          <w:smallCaps w:val="0"/>
+          <w:noProof w:val="0"/>
+          <w:color w:val="auto"/>
+          <w:sz w:val="22"/>
+          <w:szCs w:val="22"/>
+          <w:lang w:val="en-US"/>
+        </w:rPr>
+        <w:t>imported a</w:t>
+      </w:r>
+      <w:r>
+        <w:rPr>
+          <w:rFonts w:ascii="Times New Roman" w:hAnsi="Times New Roman" w:eastAsia="Times New Roman" w:cs="Times New Roman"/>
+          <w:b w:val="0"/>
+          <w:bCs w:val="0"/>
+          <w:i w:val="0"/>
+          <w:iCs w:val="0"/>
+          <w:caps w:val="0"/>
+          <w:smallCaps w:val="0"/>
+          <w:noProof w:val="0"/>
+          <w:color w:val="auto"/>
+          <w:sz w:val="22"/>
+          <w:szCs w:val="22"/>
+          <w:lang w:val="en-US"/>
+        </w:rPr>
+        <w:t xml:space="preserve">lready </w:t>
+      </w:r>
+      <w:r>
+        <w:rPr>
+          <w:rFonts w:ascii="Times New Roman" w:hAnsi="Times New Roman" w:eastAsia="Times New Roman" w:cs="Times New Roman"/>
+          <w:b w:val="0"/>
+          <w:bCs w:val="0"/>
+          <w:i w:val="0"/>
+          <w:iCs w:val="0"/>
+          <w:caps w:val="0"/>
+          <w:smallCaps w:val="0"/>
+          <w:noProof w:val="0"/>
+          <w:color w:val="auto"/>
+          <w:sz w:val="22"/>
+          <w:szCs w:val="22"/>
+          <w:lang w:val="en-US"/>
+        </w:rPr>
+        <w:t>at</w:t>
+      </w:r>
+      <w:r>
+        <w:rPr>
+          <w:rFonts w:ascii="Times New Roman" w:hAnsi="Times New Roman" w:eastAsia="Times New Roman" w:cs="Times New Roman"/>
+          <w:b w:val="0"/>
+          <w:bCs w:val="0"/>
+          <w:i w:val="0"/>
+          <w:iCs w:val="0"/>
+          <w:caps w:val="0"/>
+          <w:smallCaps w:val="0"/>
+          <w:noProof w:val="0"/>
+          <w:color w:val="auto"/>
+          <w:sz w:val="22"/>
+          <w:szCs w:val="22"/>
+          <w:lang w:val="en-US"/>
+        </w:rPr>
+        <w:t xml:space="preserve"> the top of the file</w:t>
+      </w:r>
+      <w:r>
+        <w:rPr>
+          <w:rFonts w:ascii="Times New Roman" w:hAnsi="Times New Roman" w:eastAsia="Times New Roman" w:cs="Times New Roman"/>
+          <w:b w:val="0"/>
+          <w:bCs w:val="0"/>
+          <w:i w:val="0"/>
+          <w:iCs w:val="0"/>
+          <w:caps w:val="0"/>
+          <w:smallCaps w:val="0"/>
+          <w:noProof w:val="0"/>
+          <w:color w:val="auto"/>
+          <w:sz w:val="22"/>
+          <w:szCs w:val="22"/>
+          <w:lang w:val="en-US"/>
+        </w:rPr>
+        <w:t xml:space="preserve">, enabling single and repeated bootstrap resampling for model evaluation. </w:t>
       </w:r>
     </w:p>
     <w:p>
@@ -5069,7 +5667,7 @@
       <w:footerReference w:type="default" r:id="rId16"/>
       <w:headerReference w:type="first" r:id="rId17"/>
       <w:footerReference w:type="first" r:id="rId18"/>
-      <w:pgSz w:w="11906" w:h="16838"/>
+      <w:pgSz w:w="11906" w:h="16838" w:orient="portrait"/>
       <w:pgMar w:top="1417" w:right="1701" w:bottom="1417" w:left="1701" w:header="708" w:footer="708" w:gutter="0"/>
       <w:pgNumType w:start="0"/>
       <w:cols w:space="708"/>
@@ -5159,6 +5757,11 @@
         </w:r>
       </w:p>
     </w:sdtContent>
+    <w:sdtEndPr>
+      <w:rPr>
+        <w:rFonts w:ascii="Times New Roman" w:hAnsi="Times New Roman" w:cs="Times New Roman"/>
+      </w:rPr>
+    </w:sdtEndPr>
   </w:sdt>
   <w:p>
     <w:pPr>
@@ -5314,7 +5917,7 @@
 </file>
 
 <file path=word/header2.xml><?xml version="1.0" encoding="utf-8"?>
-<w:hdr xmlns:wpc="http://schemas.microsoft.com/office/word/2010/wordprocessingCanvas" xmlns:cx="http://schemas.microsoft.com/office/drawing/2014/chartex" xmlns:cx1="http://schemas.microsoft.com/office/drawing/2015/9/8/chartex" xmlns:cx2="http://schemas.microsoft.com/office/drawing/2015/10/21/chartex" xmlns:cx3="http://schemas.microsoft.com/office/drawing/2016/5/9/chartex" xmlns:cx4="http://schemas.microsoft.com/office/drawing/2016/5/10/chartex" xmlns:cx5="http://schemas.microsoft.com/office/drawing/2016/5/11/chartex" xmlns:cx6="http://schemas.microsoft.com/office/drawing/2016/5/12/chartex" xmlns:cx7="http://schemas.microsoft.com/office/drawing/2016/5/13/chartex" xmlns:cx8="http://schemas.microsoft.com/office/drawing/2016/5/14/chartex" xmlns:mc="http://schemas.openxmlformats.org/markup-compatibility/2006" xmlns:aink="http://schemas.microsoft.com/office/drawing/2016/ink" xmlns:am3d="http://schemas.microsoft.com/office/drawing/2017/model3d" xmlns:o="urn:schemas-microsoft-com:office:office" xmlns:oel="http://schemas.microsoft.com/office/2019/extlst" xmlns:r="http://schemas.openxmlformats.org/officeDocument/2006/relationships" xmlns:m="http://schemas.openxmlformats.org/officeDocument/2006/math" xmlns:v="urn:schemas-microsoft-com:vml" xmlns:wp14="http://schemas.microsoft.com/office/word/2010/wordprocessingDrawing" xmlns:wp="http://schemas.openxmlformats.org/drawingml/2006/wordprocessingDrawing" xmlns:w10="urn:schemas-microsoft-com:office:word" xmlns:w="http://schemas.openxmlformats.org/wordprocessingml/2006/main" xmlns:w14="http://schemas.microsoft.com/office/word/2010/wordml" xmlns:w15="http://schemas.microsoft.com/office/word/2012/wordml" xmlns:w16cex="http://schemas.microsoft.com/office/word/2018/wordml/cex" xmlns:w16cid="http://schemas.microsoft.com/office/word/2016/wordml/cid" xmlns:w16="http://schemas.microsoft.com/office/word/2018/wordml" xmlns:w16du="http://schemas.microsoft.com/office/word/2023/wordml/word16du" xmlns:w16sdtdh="http://schemas.microsoft.com/office/word/2020/wordml/sdtdatahash" xmlns:w16sdtfl="http://schemas.microsoft.com/office/word/2024/wordml/sdtformatlock" xmlns:w16se="http://schemas.microsoft.com/office/word/2015/wordml/symex" xmlns:wpg="http://schemas.microsoft.com/office/word/2010/wordprocessingGroup" xmlns:wpi="http://schemas.microsoft.com/office/word/2010/wordprocessingInk" xmlns:wne="http://schemas.microsoft.com/office/word/2006/wordml" xmlns:wps="http://schemas.microsoft.com/office/word/2010/wordprocessingShape" mc:Ignorable="w14 w15 w16se w16cid w16 w16cex w16sdtdh w16sdtfl w16du wp14">
+<w:hdr xmlns:wpc="http://schemas.microsoft.com/office/word/2010/wordprocessingCanvas" xmlns:cx="http://schemas.microsoft.com/office/drawing/2014/chartex" xmlns:cx1="http://schemas.microsoft.com/office/drawing/2015/9/8/chartex" xmlns:cx2="http://schemas.microsoft.com/office/drawing/2015/10/21/chartex" xmlns:cx3="http://schemas.microsoft.com/office/drawing/2016/5/9/chartex" xmlns:cx4="http://schemas.microsoft.com/office/drawing/2016/5/10/chartex" xmlns:cx5="http://schemas.microsoft.com/office/drawing/2016/5/11/chartex" xmlns:cx6="http://schemas.microsoft.com/office/drawing/2016/5/12/chartex" xmlns:cx7="http://schemas.microsoft.com/office/drawing/2016/5/13/chartex" xmlns:cx8="http://schemas.microsoft.com/office/drawing/2016/5/14/chartex" xmlns:mc="http://schemas.openxmlformats.org/markup-compatibility/2006" xmlns:aink="http://schemas.microsoft.com/office/drawing/2016/ink" xmlns:am3d="http://schemas.microsoft.com/office/drawing/2017/model3d" xmlns:o="urn:schemas-microsoft-com:office:office" xmlns:oel="http://schemas.microsoft.com/office/2019/extlst" xmlns:r="http://schemas.openxmlformats.org/officeDocument/2006/relationships" xmlns:m="http://schemas.openxmlformats.org/officeDocument/2006/math" xmlns:v="urn:schemas-microsoft-com:vml" xmlns:wp14="http://schemas.microsoft.com/office/word/2010/wordprocessingDrawing" xmlns:wp="http://schemas.openxmlformats.org/drawingml/2006/wordprocessingDrawing" xmlns:w10="urn:schemas-microsoft-com:office:word" xmlns:w="http://schemas.openxmlformats.org/wordprocessingml/2006/main" xmlns:w14="http://schemas.microsoft.com/office/word/2010/wordml" xmlns:w15="http://schemas.microsoft.com/office/word/2012/wordml" xmlns:w16cex="http://schemas.microsoft.com/office/word/2018/wordml/cex" xmlns:w16cid="http://schemas.microsoft.com/office/word/2016/wordml/cid" xmlns:w16="http://schemas.microsoft.com/office/word/2018/wordml" xmlns:w16du="http://schemas.microsoft.com/office/word/2023/wordml/word16du" xmlns:w16sdtdh="http://schemas.microsoft.com/office/word/2020/wordml/sdtdatahash" xmlns:w16sdtfl="http://schemas.microsoft.com/office/word/2024/wordml/sdtformatlock" xmlns:w16se="http://schemas.microsoft.com/office/word/2015/wordml/symex" xmlns:wpg="http://schemas.microsoft.com/office/word/2010/wordprocessingGroup" xmlns:wpi="http://schemas.microsoft.com/office/word/2010/wordprocessingInk" xmlns:wne="http://schemas.microsoft.com/office/word/2006/wordml" xmlns:wps="http://schemas.microsoft.com/office/word/2010/wordprocessingShape" xmlns:a="http://schemas.openxmlformats.org/drawingml/2006/main" xmlns:pic="http://schemas.openxmlformats.org/drawingml/2006/picture" xmlns:a14="http://schemas.microsoft.com/office/drawing/2010/main" mc:Ignorable="w14 w15 w16se w16cid w16 w16cex w16sdtdh w16sdtfl w16du wp14">
   <w:p>
     <w:pPr>
       <w:pStyle w:val="Cabealho"/>
@@ -5530,7 +6133,7 @@
   <w:docDefaults>
     <w:rPrDefault>
       <w:rPr>
-        <w:rFonts w:asciiTheme="minorHAnsi" w:eastAsiaTheme="minorHAnsi" w:hAnsiTheme="minorHAnsi" w:cstheme="minorBidi"/>
+        <w:rFonts w:asciiTheme="minorHAnsi" w:hAnsiTheme="minorHAnsi" w:eastAsiaTheme="minorHAnsi" w:cstheme="minorBidi"/>
         <w:kern w:val="2"/>
         <w:sz w:val="22"/>
         <w:szCs w:val="22"/>
@@ -5547,14 +6150,14 @@
   <w:latentStyles w:defLockedState="0" w:defUIPriority="99" w:defSemiHidden="0" w:defUnhideWhenUsed="0" w:defQFormat="0" w:count="376">
     <w:lsdException w:name="Normal" w:uiPriority="0" w:qFormat="1"/>
     <w:lsdException w:name="heading 1" w:uiPriority="9" w:qFormat="1"/>
-    <w:lsdException w:name="heading 2" w:semiHidden="1" w:uiPriority="9" w:unhideWhenUsed="1" w:qFormat="1"/>
-    <w:lsdException w:name="heading 3" w:semiHidden="1" w:uiPriority="9" w:unhideWhenUsed="1" w:qFormat="1"/>
-    <w:lsdException w:name="heading 4" w:semiHidden="1" w:uiPriority="9" w:unhideWhenUsed="1" w:qFormat="1"/>
-    <w:lsdException w:name="heading 5" w:semiHidden="1" w:uiPriority="9" w:unhideWhenUsed="1" w:qFormat="1"/>
-    <w:lsdException w:name="heading 6" w:semiHidden="1" w:uiPriority="9" w:unhideWhenUsed="1" w:qFormat="1"/>
-    <w:lsdException w:name="heading 7" w:semiHidden="1" w:uiPriority="9" w:unhideWhenUsed="1" w:qFormat="1"/>
-    <w:lsdException w:name="heading 8" w:semiHidden="1" w:uiPriority="9" w:unhideWhenUsed="1" w:qFormat="1"/>
-    <w:lsdException w:name="heading 9" w:semiHidden="1" w:uiPriority="9" w:unhideWhenUsed="1" w:qFormat="1"/>
+    <w:lsdException w:name="heading 2" w:uiPriority="9" w:semiHidden="1" w:unhideWhenUsed="1" w:qFormat="1"/>
+    <w:lsdException w:name="heading 3" w:uiPriority="9" w:semiHidden="1" w:unhideWhenUsed="1" w:qFormat="1"/>
+    <w:lsdException w:name="heading 4" w:uiPriority="9" w:semiHidden="1" w:unhideWhenUsed="1" w:qFormat="1"/>
+    <w:lsdException w:name="heading 5" w:uiPriority="9" w:semiHidden="1" w:unhideWhenUsed="1" w:qFormat="1"/>
+    <w:lsdException w:name="heading 6" w:uiPriority="9" w:semiHidden="1" w:unhideWhenUsed="1" w:qFormat="1"/>
+    <w:lsdException w:name="heading 7" w:uiPriority="9" w:semiHidden="1" w:unhideWhenUsed="1" w:qFormat="1"/>
+    <w:lsdException w:name="heading 8" w:uiPriority="9" w:semiHidden="1" w:unhideWhenUsed="1" w:qFormat="1"/>
+    <w:lsdException w:name="heading 9" w:uiPriority="9" w:semiHidden="1" w:unhideWhenUsed="1" w:qFormat="1"/>
     <w:lsdException w:name="index 1" w:semiHidden="1" w:unhideWhenUsed="1"/>
     <w:lsdException w:name="index 2" w:semiHidden="1" w:unhideWhenUsed="1"/>
     <w:lsdException w:name="index 3" w:semiHidden="1" w:unhideWhenUsed="1"/>
@@ -5564,22 +6167,22 @@
     <w:lsdException w:name="index 7" w:semiHidden="1" w:unhideWhenUsed="1"/>
     <w:lsdException w:name="index 8" w:semiHidden="1" w:unhideWhenUsed="1"/>
     <w:lsdException w:name="index 9" w:semiHidden="1" w:unhideWhenUsed="1"/>
-    <w:lsdException w:name="toc 1" w:semiHidden="1" w:uiPriority="39" w:unhideWhenUsed="1"/>
-    <w:lsdException w:name="toc 2" w:semiHidden="1" w:uiPriority="39" w:unhideWhenUsed="1"/>
-    <w:lsdException w:name="toc 3" w:semiHidden="1" w:uiPriority="39" w:unhideWhenUsed="1"/>
-    <w:lsdException w:name="toc 4" w:semiHidden="1" w:uiPriority="39" w:unhideWhenUsed="1"/>
-    <w:lsdException w:name="toc 5" w:semiHidden="1" w:uiPriority="39" w:unhideWhenUsed="1"/>
-    <w:lsdException w:name="toc 6" w:semiHidden="1" w:uiPriority="39" w:unhideWhenUsed="1"/>
-    <w:lsdException w:name="toc 7" w:semiHidden="1" w:uiPriority="39" w:unhideWhenUsed="1"/>
-    <w:lsdException w:name="toc 8" w:semiHidden="1" w:uiPriority="39" w:unhideWhenUsed="1"/>
-    <w:lsdException w:name="toc 9" w:semiHidden="1" w:uiPriority="39" w:unhideWhenUsed="1"/>
+    <w:lsdException w:name="toc 1" w:uiPriority="39" w:semiHidden="1" w:unhideWhenUsed="1"/>
+    <w:lsdException w:name="toc 2" w:uiPriority="39" w:semiHidden="1" w:unhideWhenUsed="1"/>
+    <w:lsdException w:name="toc 3" w:uiPriority="39" w:semiHidden="1" w:unhideWhenUsed="1"/>
+    <w:lsdException w:name="toc 4" w:uiPriority="39" w:semiHidden="1" w:unhideWhenUsed="1"/>
+    <w:lsdException w:name="toc 5" w:uiPriority="39" w:semiHidden="1" w:unhideWhenUsed="1"/>
+    <w:lsdException w:name="toc 6" w:uiPriority="39" w:semiHidden="1" w:unhideWhenUsed="1"/>
+    <w:lsdException w:name="toc 7" w:uiPriority="39" w:semiHidden="1" w:unhideWhenUsed="1"/>
+    <w:lsdException w:name="toc 8" w:uiPriority="39" w:semiHidden="1" w:unhideWhenUsed="1"/>
+    <w:lsdException w:name="toc 9" w:uiPriority="39" w:semiHidden="1" w:unhideWhenUsed="1"/>
     <w:lsdException w:name="Normal Indent" w:semiHidden="1" w:unhideWhenUsed="1"/>
     <w:lsdException w:name="footnote text" w:semiHidden="1" w:unhideWhenUsed="1"/>
     <w:lsdException w:name="annotation text" w:semiHidden="1" w:unhideWhenUsed="1"/>
     <w:lsdException w:name="header" w:semiHidden="1" w:unhideWhenUsed="1"/>
     <w:lsdException w:name="footer" w:semiHidden="1" w:unhideWhenUsed="1"/>
     <w:lsdException w:name="index heading" w:semiHidden="1" w:unhideWhenUsed="1"/>
-    <w:lsdException w:name="caption" w:semiHidden="1" w:uiPriority="35" w:unhideWhenUsed="1" w:qFormat="1"/>
+    <w:lsdException w:name="caption" w:uiPriority="35" w:semiHidden="1" w:unhideWhenUsed="1" w:qFormat="1"/>
     <w:lsdException w:name="table of figures" w:semiHidden="1" w:unhideWhenUsed="1"/>
     <w:lsdException w:name="envelope address" w:semiHidden="1" w:unhideWhenUsed="1"/>
     <w:lsdException w:name="envelope return" w:semiHidden="1" w:unhideWhenUsed="1"/>
@@ -5610,7 +6213,7 @@
     <w:lsdException w:name="Title" w:uiPriority="10" w:qFormat="1"/>
     <w:lsdException w:name="Closing" w:semiHidden="1" w:unhideWhenUsed="1"/>
     <w:lsdException w:name="Signature" w:semiHidden="1" w:unhideWhenUsed="1"/>
-    <w:lsdException w:name="Default Paragraph Font" w:semiHidden="1" w:uiPriority="1" w:unhideWhenUsed="1"/>
+    <w:lsdException w:name="Default Paragraph Font" w:uiPriority="1" w:semiHidden="1" w:unhideWhenUsed="1"/>
     <w:lsdException w:name="Body Text" w:semiHidden="1" w:unhideWhenUsed="1"/>
     <w:lsdException w:name="Body Text Indent" w:semiHidden="1" w:unhideWhenUsed="1"/>
     <w:lsdException w:name="List Continue" w:semiHidden="1" w:unhideWhenUsed="1"/>
@@ -5810,8 +6413,8 @@
     <w:lsdException w:name="Subtle Reference" w:uiPriority="31" w:qFormat="1"/>
     <w:lsdException w:name="Intense Reference" w:uiPriority="32" w:qFormat="1"/>
     <w:lsdException w:name="Book Title" w:uiPriority="33" w:qFormat="1"/>
-    <w:lsdException w:name="Bibliography" w:semiHidden="1" w:uiPriority="37" w:unhideWhenUsed="1"/>
-    <w:lsdException w:name="TOC Heading" w:semiHidden="1" w:uiPriority="39" w:unhideWhenUsed="1" w:qFormat="1"/>
+    <w:lsdException w:name="Bibliography" w:uiPriority="37" w:semiHidden="1" w:unhideWhenUsed="1"/>
+    <w:lsdException w:name="TOC Heading" w:uiPriority="39" w:semiHidden="1" w:unhideWhenUsed="1" w:qFormat="1"/>
     <w:lsdException w:name="Plain Table 1" w:uiPriority="41"/>
     <w:lsdException w:name="Plain Table 2" w:uiPriority="42"/>
     <w:lsdException w:name="Plain Table 3" w:uiPriority="43"/>
@@ -5922,7 +6525,7 @@
     <w:lsdException w:name="Unresolved Mention" w:semiHidden="1" w:unhideWhenUsed="1"/>
     <w:lsdException w:name="Smart Link" w:semiHidden="1" w:unhideWhenUsed="1"/>
   </w:latentStyles>
-  <w:style w:type="paragraph" w:default="1" w:styleId="Normal">
+  <w:style w:type="paragraph" w:styleId="Normal" w:default="1">
     <w:name w:val="Normal"/>
     <w:qFormat/>
   </w:style>
@@ -5941,7 +6544,7 @@
       <w:outlineLvl w:val="0"/>
     </w:pPr>
     <w:rPr>
-      <w:rFonts w:asciiTheme="majorHAnsi" w:eastAsiaTheme="majorEastAsia" w:hAnsiTheme="majorHAnsi" w:cstheme="majorBidi"/>
+      <w:rFonts w:asciiTheme="majorHAnsi" w:hAnsiTheme="majorHAnsi" w:eastAsiaTheme="majorEastAsia" w:cstheme="majorBidi"/>
       <w:color w:val="0F4761" w:themeColor="accent1" w:themeShade="BF"/>
       <w:sz w:val="40"/>
       <w:szCs w:val="40"/>
@@ -5964,7 +6567,7 @@
       <w:outlineLvl w:val="1"/>
     </w:pPr>
     <w:rPr>
-      <w:rFonts w:asciiTheme="majorHAnsi" w:eastAsiaTheme="majorEastAsia" w:hAnsiTheme="majorHAnsi" w:cstheme="majorBidi"/>
+      <w:rFonts w:asciiTheme="majorHAnsi" w:hAnsiTheme="majorHAnsi" w:eastAsiaTheme="majorEastAsia" w:cstheme="majorBidi"/>
       <w:color w:val="0F4761" w:themeColor="accent1" w:themeShade="BF"/>
       <w:sz w:val="32"/>
       <w:szCs w:val="32"/>
@@ -6125,12 +6728,12 @@
       <w:color w:val="272727" w:themeColor="text1" w:themeTint="D8"/>
     </w:rPr>
   </w:style>
-  <w:style w:type="character" w:default="1" w:styleId="Tipodeletrapredefinidodopargrafo">
+  <w:style w:type="character" w:styleId="Tipodeletrapredefinidodopargrafo" w:default="1">
     <w:name w:val="Default Paragraph Font"/>
     <w:uiPriority w:val="1"/>
     <w:unhideWhenUsed/>
   </w:style>
-  <w:style w:type="table" w:default="1" w:styleId="Tabelanormal">
+  <w:style w:type="table" w:styleId="Tabelanormal" w:default="1">
     <w:name w:val="Normal Table"/>
     <w:uiPriority w:val="99"/>
     <w:semiHidden/>
@@ -6145,26 +6748,26 @@
       </w:tblCellMar>
     </w:tblPr>
   </w:style>
-  <w:style w:type="numbering" w:default="1" w:styleId="Semlista">
+  <w:style w:type="numbering" w:styleId="Semlista" w:default="1">
     <w:name w:val="No List"/>
     <w:uiPriority w:val="99"/>
     <w:semiHidden/>
     <w:unhideWhenUsed/>
   </w:style>
-  <w:style w:type="character" w:customStyle="1" w:styleId="Ttulo1Carter">
+  <w:style w:type="character" w:styleId="Ttulo1Carter" w:customStyle="1">
     <w:name w:val="Título 1 Caráter"/>
     <w:basedOn w:val="Tipodeletrapredefinidodopargrafo"/>
     <w:link w:val="Ttulo1"/>
     <w:uiPriority w:val="9"/>
     <w:rsid w:val="004C441A"/>
     <w:rPr>
-      <w:rFonts w:asciiTheme="majorHAnsi" w:eastAsiaTheme="majorEastAsia" w:hAnsiTheme="majorHAnsi" w:cstheme="majorBidi"/>
+      <w:rFonts w:asciiTheme="majorHAnsi" w:hAnsiTheme="majorHAnsi" w:eastAsiaTheme="majorEastAsia" w:cstheme="majorBidi"/>
       <w:color w:val="0F4761" w:themeColor="accent1" w:themeShade="BF"/>
       <w:sz w:val="40"/>
       <w:szCs w:val="40"/>
     </w:rPr>
   </w:style>
-  <w:style w:type="character" w:customStyle="1" w:styleId="Ttulo2Carter">
+  <w:style w:type="character" w:styleId="Ttulo2Carter" w:customStyle="1">
     <w:name w:val="Título 2 Caráter"/>
     <w:basedOn w:val="Tipodeletrapredefinidodopargrafo"/>
     <w:link w:val="Ttulo2"/>
@@ -6172,13 +6775,13 @@
     <w:semiHidden/>
     <w:rsid w:val="004C441A"/>
     <w:rPr>
-      <w:rFonts w:asciiTheme="majorHAnsi" w:eastAsiaTheme="majorEastAsia" w:hAnsiTheme="majorHAnsi" w:cstheme="majorBidi"/>
+      <w:rFonts w:asciiTheme="majorHAnsi" w:hAnsiTheme="majorHAnsi" w:eastAsiaTheme="majorEastAsia" w:cstheme="majorBidi"/>
       <w:color w:val="0F4761" w:themeColor="accent1" w:themeShade="BF"/>
       <w:sz w:val="32"/>
       <w:szCs w:val="32"/>
     </w:rPr>
   </w:style>
-  <w:style w:type="character" w:customStyle="1" w:styleId="Ttulo3Carter">
+  <w:style w:type="character" w:styleId="Ttulo3Carter" w:customStyle="1">
     <w:name w:val="Título 3 Caráter"/>
     <w:basedOn w:val="Tipodeletrapredefinidodopargrafo"/>
     <w:link w:val="Ttulo3"/>
@@ -6192,7 +6795,7 @@
       <w:szCs w:val="28"/>
     </w:rPr>
   </w:style>
-  <w:style w:type="character" w:customStyle="1" w:styleId="Ttulo4Carter">
+  <w:style w:type="character" w:styleId="Ttulo4Carter" w:customStyle="1">
     <w:name w:val="Título 4 Caráter"/>
     <w:basedOn w:val="Tipodeletrapredefinidodopargrafo"/>
     <w:link w:val="Ttulo4"/>
@@ -6206,7 +6809,7 @@
       <w:color w:val="0F4761" w:themeColor="accent1" w:themeShade="BF"/>
     </w:rPr>
   </w:style>
-  <w:style w:type="character" w:customStyle="1" w:styleId="Ttulo5Carter">
+  <w:style w:type="character" w:styleId="Ttulo5Carter" w:customStyle="1">
     <w:name w:val="Título 5 Caráter"/>
     <w:basedOn w:val="Tipodeletrapredefinidodopargrafo"/>
     <w:link w:val="Ttulo5"/>
@@ -6218,7 +6821,7 @@
       <w:color w:val="0F4761" w:themeColor="accent1" w:themeShade="BF"/>
     </w:rPr>
   </w:style>
-  <w:style w:type="character" w:customStyle="1" w:styleId="Ttulo6Carter">
+  <w:style w:type="character" w:styleId="Ttulo6Carter" w:customStyle="1">
     <w:name w:val="Título 6 Caráter"/>
     <w:basedOn w:val="Tipodeletrapredefinidodopargrafo"/>
     <w:link w:val="Ttulo6"/>
@@ -6232,7 +6835,7 @@
       <w:color w:val="595959" w:themeColor="text1" w:themeTint="A6"/>
     </w:rPr>
   </w:style>
-  <w:style w:type="character" w:customStyle="1" w:styleId="Ttulo7Carter">
+  <w:style w:type="character" w:styleId="Ttulo7Carter" w:customStyle="1">
     <w:name w:val="Título 7 Caráter"/>
     <w:basedOn w:val="Tipodeletrapredefinidodopargrafo"/>
     <w:link w:val="Ttulo7"/>
@@ -6244,7 +6847,7 @@
       <w:color w:val="595959" w:themeColor="text1" w:themeTint="A6"/>
     </w:rPr>
   </w:style>
-  <w:style w:type="character" w:customStyle="1" w:styleId="Ttulo8Carter">
+  <w:style w:type="character" w:styleId="Ttulo8Carter" w:customStyle="1">
     <w:name w:val="Título 8 Caráter"/>
     <w:basedOn w:val="Tipodeletrapredefinidodopargrafo"/>
     <w:link w:val="Ttulo8"/>
@@ -6258,7 +6861,7 @@
       <w:color w:val="272727" w:themeColor="text1" w:themeTint="D8"/>
     </w:rPr>
   </w:style>
-  <w:style w:type="character" w:customStyle="1" w:styleId="Ttulo9Carter">
+  <w:style w:type="character" w:styleId="Ttulo9Carter" w:customStyle="1">
     <w:name w:val="Título 9 Caráter"/>
     <w:basedOn w:val="Tipodeletrapredefinidodopargrafo"/>
     <w:link w:val="Ttulo9"/>
@@ -6283,21 +6886,21 @@
       <w:contextualSpacing/>
     </w:pPr>
     <w:rPr>
-      <w:rFonts w:asciiTheme="majorHAnsi" w:eastAsiaTheme="majorEastAsia" w:hAnsiTheme="majorHAnsi" w:cstheme="majorBidi"/>
+      <w:rFonts w:asciiTheme="majorHAnsi" w:hAnsiTheme="majorHAnsi" w:eastAsiaTheme="majorEastAsia" w:cstheme="majorBidi"/>
       <w:spacing w:val="-10"/>
       <w:kern w:val="28"/>
       <w:sz w:val="56"/>
       <w:szCs w:val="56"/>
     </w:rPr>
   </w:style>
-  <w:style w:type="character" w:customStyle="1" w:styleId="TtuloCarter">
+  <w:style w:type="character" w:styleId="TtuloCarter" w:customStyle="1">
     <w:name w:val="Título Caráter"/>
     <w:basedOn w:val="Tipodeletrapredefinidodopargrafo"/>
     <w:link w:val="Ttulo"/>
     <w:uiPriority w:val="10"/>
     <w:rsid w:val="004C441A"/>
     <w:rPr>
-      <w:rFonts w:asciiTheme="majorHAnsi" w:eastAsiaTheme="majorEastAsia" w:hAnsiTheme="majorHAnsi" w:cstheme="majorBidi"/>
+      <w:rFonts w:asciiTheme="majorHAnsi" w:hAnsiTheme="majorHAnsi" w:eastAsiaTheme="majorEastAsia" w:cstheme="majorBidi"/>
       <w:spacing w:val="-10"/>
       <w:kern w:val="28"/>
       <w:sz w:val="56"/>
@@ -6325,7 +6928,7 @@
       <w:szCs w:val="28"/>
     </w:rPr>
   </w:style>
-  <w:style w:type="character" w:customStyle="1" w:styleId="SubttuloCarter">
+  <w:style w:type="character" w:styleId="SubttuloCarter" w:customStyle="1">
     <w:name w:val="Subtítulo Caráter"/>
     <w:basedOn w:val="Tipodeletrapredefinidodopargrafo"/>
     <w:link w:val="Subttulo"/>
@@ -6357,7 +6960,7 @@
       <w:color w:val="404040" w:themeColor="text1" w:themeTint="BF"/>
     </w:rPr>
   </w:style>
-  <w:style w:type="character" w:customStyle="1" w:styleId="CitaoCarter">
+  <w:style w:type="character" w:styleId="CitaoCarter" w:customStyle="1">
     <w:name w:val="Citação Caráter"/>
     <w:basedOn w:val="Tipodeletrapredefinidodopargrafo"/>
     <w:link w:val="Citao"/>
@@ -6402,8 +7005,8 @@
     <w:rsid w:val="004C441A"/>
     <w:pPr>
       <w:pBdr>
-        <w:top w:val="single" w:sz="4" w:space="10" w:color="0F4761" w:themeColor="accent1" w:themeShade="BF"/>
-        <w:bottom w:val="single" w:sz="4" w:space="10" w:color="0F4761" w:themeColor="accent1" w:themeShade="BF"/>
+        <w:top w:val="single" w:color="0F4761" w:themeColor="accent1" w:themeShade="BF" w:sz="4" w:space="10"/>
+        <w:bottom w:val="single" w:color="0F4761" w:themeColor="accent1" w:themeShade="BF" w:sz="4" w:space="10"/>
       </w:pBdr>
       <w:spacing w:before="360" w:after="360"/>
       <w:ind w:left="864" w:right="864"/>
@@ -6415,7 +7018,7 @@
       <w:color w:val="0F4761" w:themeColor="accent1" w:themeShade="BF"/>
     </w:rPr>
   </w:style>
-  <w:style w:type="character" w:customStyle="1" w:styleId="CitaoIntensaCarter">
+  <w:style w:type="character" w:styleId="CitaoIntensaCarter" w:customStyle="1">
     <w:name w:val="Citação Intensa Caráter"/>
     <w:basedOn w:val="Tipodeletrapredefinidodopargrafo"/>
     <w:link w:val="CitaoIntensa"/>
@@ -6479,7 +7082,7 @@
       <w:spacing w:after="0" w:line="240" w:lineRule="auto"/>
     </w:pPr>
   </w:style>
-  <w:style w:type="character" w:customStyle="1" w:styleId="CabealhoCarter">
+  <w:style w:type="character" w:styleId="CabealhoCarter" w:customStyle="1">
     <w:name w:val="Cabeçalho Caráter"/>
     <w:basedOn w:val="Tipodeletrapredefinidodopargrafo"/>
     <w:link w:val="Cabealho"/>
@@ -6501,7 +7104,7 @@
       <w:spacing w:after="0" w:line="240" w:lineRule="auto"/>
     </w:pPr>
   </w:style>
-  <w:style w:type="character" w:customStyle="1" w:styleId="RodapCarter">
+  <w:style w:type="character" w:styleId="RodapCarter" w:customStyle="1">
     <w:name w:val="Rodapé Caráter"/>
     <w:basedOn w:val="Tipodeletrapredefinidodopargrafo"/>
     <w:link w:val="Rodap"/>
@@ -6535,7 +7138,7 @@
 </file>
 
 <file path=word/theme/theme1.xml><?xml version="1.0" encoding="utf-8"?>
-<a:theme xmlns:a="http://schemas.openxmlformats.org/drawingml/2006/main" name="Tema do Office">
+<a:theme xmlns:a="http://schemas.openxmlformats.org/drawingml/2006/main" xmlns:thm15="http://schemas.microsoft.com/office/thememl/2012/main" name="Tema do Office">
   <a:themeElements>
     <a:clrScheme name="Office">
       <a:dk1>

</xml_diff>

<commit_message>
chore(project): Made some changes
</commit_message>
<xml_diff>
--- a/PRACTICE_6/G03_Report_06.docx
+++ b/PRACTICE_6/G03_Report_06.docx
@@ -3576,7 +3576,7 @@
     <w:p>
       <w:pPr>
         <w:pStyle w:val="Normal"/>
-        <w:spacing w:lineRule="auto" w:line="9"/>
+        <w:spacing w:lineRule="auto" w:line="7"/>
         <w:rPr>
           <w:sz w:val="22"/>
           <w:szCs w:val="22"/>
@@ -3597,7 +3597,7 @@
     <w:p>
       <w:pPr>
         <w:pStyle w:val="Normal"/>
-        <w:spacing w:lineRule="auto" w:line="9"/>
+        <w:spacing w:lineRule="auto" w:line="7"/>
         <w:rPr>
           <w:sz w:val="22"/>
           <w:szCs w:val="22"/>
@@ -3618,7 +3618,7 @@
     <w:p>
       <w:pPr>
         <w:pStyle w:val="Normal"/>
-        <w:spacing w:lineRule="auto" w:line="9"/>
+        <w:spacing w:lineRule="auto" w:line="7"/>
         <w:rPr>
           <w:sz w:val="22"/>
           <w:szCs w:val="22"/>
@@ -3659,7 +3659,7 @@
     <w:p>
       <w:pPr>
         <w:pStyle w:val="Normal"/>
-        <w:spacing w:lineRule="auto" w:line="9"/>
+        <w:spacing w:lineRule="auto" w:line="7"/>
         <w:rPr>
           <w:highlight w:val="none"/>
           <w:shd w:fill="auto" w:val="clear"/>
@@ -6647,16 +6647,7 @@
           <w:szCs w:val="22"/>
           <w:shd w:fill="auto" w:val="clear"/>
         </w:rPr>
-        <w:t>Ao desativar estes avisos, perde-se informa</w:t>
-      </w:r>
-      <w:r>
-        <w:rPr>
-          <w:rFonts w:cs="Times New Roman" w:ascii="Times New Roman" w:hAnsi="Times New Roman"/>
-          <w:sz w:val="22"/>
-          <w:szCs w:val="22"/>
-          <w:shd w:fill="auto" w:val="clear"/>
-        </w:rPr>
-        <w:t>ç</w:t>
+        <w:t>Ao desativar estes avisos, perde-se informaç</w:t>
       </w:r>
       <w:r>
         <w:rPr>
@@ -6800,7 +6791,7 @@
         <w:docPartGallery w:val="Page Numbers (Bottom of Page)"/>
         <w:docPartUnique w:val="true"/>
       </w:docPartObj>
-      <w:id w:val="706032629"/>
+      <w:id w:val="1943972257"/>
     </w:sdtPr>
     <w:sdtContent>
       <w:p>
@@ -6923,12 +6914,12 @@
           <wp:effectExtent l="0" t="0" r="0" b="0"/>
           <wp:wrapTight wrapText="bothSides">
             <wp:wrapPolygon edited="0">
-              <wp:start x="-14" y="0"/>
-              <wp:lineTo x="-14" y="19517"/>
-              <wp:lineTo x="21015" y="19517"/>
-              <wp:lineTo x="21015" y="15964"/>
-              <wp:lineTo x="18125" y="0"/>
-              <wp:lineTo x="-14" y="0"/>
+              <wp:start x="-18" y="0"/>
+              <wp:lineTo x="-18" y="19510"/>
+              <wp:lineTo x="21012" y="19510"/>
+              <wp:lineTo x="21012" y="15957"/>
+              <wp:lineTo x="18120" y="0"/>
+              <wp:lineTo x="-18" y="0"/>
             </wp:wrapPolygon>
           </wp:wrapTight>
           <wp:docPr id="24" name="Image11" descr="Uma imagem com Tipo de letra, Gráficos, logótipo, design&#10;&#10;Os conteúdos gerados por IA podem estar incorretos."/>

</xml_diff>